<commit_message>
docs(aime): rename People to Contacts and align the automation testing guide
- Call the deal workbench tab Contacts across plans, testing guides, and QA harnesses.
- Match Jake and Audri's Aime guide to live staging (mailbox census vs this user, recovery verbs, posture menu, Inspection reminders).
- Add the Aime automation Chrome QA harness for staging retests.
</commit_message>
<xml_diff>
--- a/AIME_AI_AUTOMATION_TESTING_GUIDELINES_2026-08-18.docx
+++ b/AIME_AI_AUTOMATION_TESTING_GUIDELINES_2026-08-18.docx
@@ -2413,7 +2413,35 @@
           <w:b w:val="0"/>
           <w:sz w:val="20"/>
         </w:rPr>
-        <w:t>Connected vs not connected is obvious. Example: “Connected as you@gmail.com.”</w:t>
+        <w:t xml:space="preserve">Connected vs not connected is obvious </w:t>
+      </w:r>
+      <w:r>
+        <w:rPr>
+          <w:b/>
+          <w:sz w:val="20"/>
+        </w:rPr>
+        <w:t>for this user</w:t>
+      </w:r>
+      <w:r>
+        <w:rPr>
+          <w:b w:val="0"/>
+          <w:sz w:val="20"/>
+        </w:rPr>
+        <w:t xml:space="preserve">. Overnight’s “Mailboxes · N healthy / N connected” is the workspace census and can include other people’s inboxes. Example: Overnight says 4 connected, but Email &amp; E-signature still shows </w:t>
+      </w:r>
+      <w:r>
+        <w:rPr>
+          <w:b/>
+          <w:sz w:val="20"/>
+        </w:rPr>
+        <w:t>Connect</w:t>
+      </w:r>
+      <w:r>
+        <w:rPr>
+          <w:b w:val="0"/>
+          <w:sz w:val="20"/>
+        </w:rPr>
+        <w:t xml:space="preserve"> on Gmail — this account is not connected. Connect it before any Send test.</w:t>
       </w:r>
     </w:p>
     <w:p>
@@ -2433,7 +2461,7 @@
           <w:b w:val="0"/>
           <w:sz w:val="20"/>
         </w:rPr>
-        <w:t xml:space="preserve">Test connection only checks the saved credentials. Open that mailbox: there is </w:t>
+        <w:t xml:space="preserve">Test connection only appears after a mailbox is connected. It only checks the saved credentials. Open that mailbox: there is </w:t>
       </w:r>
       <w:r>
         <w:rPr>
@@ -4088,7 +4116,21 @@
           <w:b w:val="0"/>
           <w:sz w:val="20"/>
         </w:rPr>
-        <w:t xml:space="preserve"> unless you turned it on. Named letters is </w:t>
+        <w:t xml:space="preserve"> on a brand-new workspace. On a workspace that is already in use it may already be </w:t>
+      </w:r>
+      <w:r>
+        <w:rPr>
+          <w:b/>
+          <w:sz w:val="20"/>
+        </w:rPr>
+        <w:t>Allowed</w:t>
+      </w:r>
+      <w:r>
+        <w:rPr>
+          <w:b w:val="0"/>
+          <w:sz w:val="20"/>
+        </w:rPr>
+        <w:t xml:space="preserve"> — write down what you see, and put it back if you change it. Named letters is </w:t>
       </w:r>
       <w:r>
         <w:rPr>
@@ -4506,7 +4548,35 @@
           <w:b w:val="0"/>
           <w:sz w:val="20"/>
         </w:rPr>
-        <w:t>. Wait for the toast. Example: “Draft sweep ran — Prepared 4 emails in Email review. Nothing was sent.”</w:t>
+        <w:t xml:space="preserve">. Wait for the toast. Example: title </w:t>
+      </w:r>
+      <w:r>
+        <w:rPr>
+          <w:b/>
+          <w:sz w:val="20"/>
+        </w:rPr>
+        <w:t>Draft sweep ran</w:t>
+      </w:r>
+      <w:r>
+        <w:rPr>
+          <w:b w:val="0"/>
+          <w:sz w:val="20"/>
+        </w:rPr>
+        <w:t xml:space="preserve">, description “Prepared 4 emails in Email review. Nothing was sent.” The toast still says Email review; the page is Intelligence → </w:t>
+      </w:r>
+      <w:r>
+        <w:rPr>
+          <w:b/>
+          <w:sz w:val="20"/>
+        </w:rPr>
+        <w:t>Email</w:t>
+      </w:r>
+      <w:r>
+        <w:rPr>
+          <w:b w:val="0"/>
+          <w:sz w:val="20"/>
+        </w:rPr>
+        <w:t>.</w:t>
       </w:r>
     </w:p>
     <w:p>
@@ -4983,7 +5053,7 @@
           <w:b w:val="0"/>
           <w:sz w:val="20"/>
         </w:rPr>
-        <w:t>3 waiting</w:t>
+        <w:t>31 waiting · 8 ready to send</w:t>
       </w:r>
       <w:r>
         <w:rPr>
@@ -5277,7 +5347,21 @@
           <w:b w:val="0"/>
           <w:sz w:val="20"/>
         </w:rPr>
-        <w:t>Breadcrumb: Workflow › Needs You. Title: Needs You.</w:t>
+        <w:t xml:space="preserve">Breadcrumb: Workflow › Needs You. Title: Needs You, with a pill like </w:t>
+      </w:r>
+      <w:r>
+        <w:rPr>
+          <w:b/>
+          <w:sz w:val="20"/>
+        </w:rPr>
+        <w:t>31 waiting · 8 ready to send</w:t>
+      </w:r>
+      <w:r>
+        <w:rPr>
+          <w:b w:val="0"/>
+          <w:sz w:val="20"/>
+        </w:rPr>
+        <w:t xml:space="preserve"> (the number is live; Loading must go away).</w:t>
       </w:r>
     </w:p>
     <w:p>
@@ -5453,7 +5537,175 @@
           <w:b w:val="0"/>
           <w:sz w:val="20"/>
         </w:rPr>
-        <w:t>Recovery verbs that exist on the card: Add contact, Upload document, Reconnect mailbox, Switch this deal off Manual.</w:t>
+        <w:t xml:space="preserve">Recovery verbs that exist on the card: </w:t>
+      </w:r>
+      <w:r>
+        <w:rPr>
+          <w:b/>
+          <w:sz w:val="20"/>
+        </w:rPr>
+        <w:t>Add contact</w:t>
+      </w:r>
+      <w:r>
+        <w:rPr>
+          <w:b w:val="0"/>
+          <w:sz w:val="20"/>
+        </w:rPr>
+        <w:t xml:space="preserve"> (opens that deal’s </w:t>
+      </w:r>
+      <w:r>
+        <w:rPr>
+          <w:b/>
+          <w:sz w:val="20"/>
+        </w:rPr>
+        <w:t>Contacts</w:t>
+      </w:r>
+      <w:r>
+        <w:rPr>
+          <w:b w:val="0"/>
+          <w:sz w:val="20"/>
+        </w:rPr>
+        <w:t xml:space="preserve"> tab, not the sidebar directory), </w:t>
+      </w:r>
+      <w:r>
+        <w:rPr>
+          <w:b/>
+          <w:sz w:val="20"/>
+        </w:rPr>
+        <w:t>Upload document</w:t>
+      </w:r>
+      <w:r>
+        <w:rPr>
+          <w:b w:val="0"/>
+          <w:sz w:val="20"/>
+        </w:rPr>
+        <w:t xml:space="preserve">, </w:t>
+      </w:r>
+      <w:r>
+        <w:rPr>
+          <w:b/>
+          <w:sz w:val="20"/>
+        </w:rPr>
+        <w:t>Reconnect mailbox</w:t>
+      </w:r>
+      <w:r>
+        <w:rPr>
+          <w:b w:val="0"/>
+          <w:sz w:val="20"/>
+        </w:rPr>
+        <w:t xml:space="preserve"> / </w:t>
+      </w:r>
+      <w:r>
+        <w:rPr>
+          <w:b/>
+          <w:sz w:val="20"/>
+        </w:rPr>
+        <w:t>Connect mailbox</w:t>
+      </w:r>
+      <w:r>
+        <w:rPr>
+          <w:b w:val="0"/>
+          <w:sz w:val="20"/>
+        </w:rPr>
+        <w:t xml:space="preserve">, </w:t>
+      </w:r>
+      <w:r>
+        <w:rPr>
+          <w:b/>
+          <w:sz w:val="20"/>
+        </w:rPr>
+        <w:t>Change due date</w:t>
+      </w:r>
+      <w:r>
+        <w:rPr>
+          <w:b w:val="0"/>
+          <w:sz w:val="20"/>
+        </w:rPr>
+        <w:t xml:space="preserve">, </w:t>
+      </w:r>
+      <w:r>
+        <w:rPr>
+          <w:b/>
+          <w:sz w:val="20"/>
+        </w:rPr>
+        <w:t>Switch this deal off Manual</w:t>
+      </w:r>
+      <w:r>
+        <w:rPr>
+          <w:b w:val="0"/>
+          <w:sz w:val="20"/>
+        </w:rPr>
+        <w:t xml:space="preserve">. A more-than-30-days-overdue card also shows </w:t>
+      </w:r>
+      <w:r>
+        <w:rPr>
+          <w:b/>
+          <w:sz w:val="20"/>
+        </w:rPr>
+        <w:t>Use today's date and retry</w:t>
+      </w:r>
+      <w:r>
+        <w:rPr>
+          <w:b w:val="0"/>
+          <w:sz w:val="20"/>
+        </w:rPr>
+        <w:t xml:space="preserve">. Other cards may say </w:t>
+      </w:r>
+      <w:r>
+        <w:rPr>
+          <w:b/>
+          <w:sz w:val="20"/>
+        </w:rPr>
+        <w:t>Review signatures</w:t>
+      </w:r>
+      <w:r>
+        <w:rPr>
+          <w:b w:val="0"/>
+          <w:sz w:val="20"/>
+        </w:rPr>
+        <w:t xml:space="preserve">, </w:t>
+      </w:r>
+      <w:r>
+        <w:rPr>
+          <w:b/>
+          <w:sz w:val="20"/>
+        </w:rPr>
+        <w:t>Open tasks</w:t>
+      </w:r>
+      <w:r>
+        <w:rPr>
+          <w:b w:val="0"/>
+          <w:sz w:val="20"/>
+        </w:rPr>
+        <w:t xml:space="preserve">, or </w:t>
+      </w:r>
+      <w:r>
+        <w:rPr>
+          <w:b/>
+          <w:sz w:val="20"/>
+        </w:rPr>
+        <w:t>Complete your profile</w:t>
+      </w:r>
+      <w:r>
+        <w:rPr>
+          <w:b w:val="0"/>
+          <w:sz w:val="20"/>
+        </w:rPr>
+        <w:t xml:space="preserve"> — use the verb on the card. The white box under </w:t>
+      </w:r>
+      <w:r>
+        <w:rPr>
+          <w:b/>
+          <w:sz w:val="20"/>
+        </w:rPr>
+        <w:t>Why the AI is asking</w:t>
+      </w:r>
+      <w:r>
+        <w:rPr>
+          <w:b w:val="0"/>
+          <w:sz w:val="20"/>
+        </w:rPr>
+        <w:t xml:space="preserve"> is the reason; the muted line under it can be shorter. Do not Fail if both are present.</w:t>
       </w:r>
     </w:p>
     <w:p>
@@ -5890,7 +6142,7 @@
           <w:b w:val="0"/>
           <w:sz w:val="20"/>
         </w:rPr>
-        <w:t>Body: the extraction double-check agreed, key fields cleared the confidence tier, timeline / checklist / task plan are ready below. Confirm the anchor date, then approve — or open any step from the top bar.</w:t>
+        <w:t>Body: The extraction double-check agreed, every key field cleared the confidence tier, and the timeline, checklist, and task plan are ready below. Confirm the anchor date, then approve — or open any step from the top bar to drill in.</w:t>
       </w:r>
     </w:p>
     <w:p>
@@ -6434,7 +6686,35 @@
           <w:b w:val="0"/>
           <w:sz w:val="20"/>
         </w:rPr>
-        <w:t>Open the file. Find Manual / Assisted / Autopilot in the header. Read the caption under it. Example on Assisted: *Routine work runs. Named letters are drafted — you tap Send.*</w:t>
+        <w:t xml:space="preserve">Open the file. Find the </w:t>
+      </w:r>
+      <w:r>
+        <w:rPr>
+          <w:b/>
+          <w:sz w:val="20"/>
+        </w:rPr>
+        <w:t>Autopilot / Assisted / Manual</w:t>
+      </w:r>
+      <w:r>
+        <w:rPr>
+          <w:b w:val="0"/>
+          <w:sz w:val="20"/>
+        </w:rPr>
+        <w:t xml:space="preserve"> control in the header (zap icon). The one-line caption is </w:t>
+      </w:r>
+      <w:r>
+        <w:rPr>
+          <w:b/>
+          <w:sz w:val="20"/>
+        </w:rPr>
+        <w:t>inside that menu</w:t>
+      </w:r>
+      <w:r>
+        <w:rPr>
+          <w:b w:val="0"/>
+          <w:sz w:val="20"/>
+        </w:rPr>
+        <w:t>, not printed under the chip. Open the menu and read the caption on the current choice. Example on Autopilot: *Authorized letters send without a tap when confidence is high enough. Everything else is drafted for you.*</w:t>
       </w:r>
     </w:p>
     <w:p>
@@ -6454,7 +6734,7 @@
           <w:b w:val="0"/>
           <w:sz w:val="20"/>
         </w:rPr>
-        <w:t xml:space="preserve">Open the menu. If </w:t>
+        <w:t xml:space="preserve">In the same menu, if </w:t>
       </w:r>
       <w:r>
         <w:rPr>
@@ -6468,7 +6748,7 @@
           <w:b w:val="0"/>
           <w:sz w:val="20"/>
         </w:rPr>
-        <w:t xml:space="preserve"> is listed, click it once. Example toast: “This deal follows the workspace default (assisted).”</w:t>
+        <w:t xml:space="preserve"> is listed, you may click it once. Example toast: “This deal follows the workspace default (autopilot).” Put the pin back if you need a custom posture for later features.</w:t>
       </w:r>
     </w:p>
     <w:p>
@@ -6488,21 +6768,7 @@
           <w:b w:val="0"/>
           <w:sz w:val="20"/>
         </w:rPr>
-        <w:t xml:space="preserve">Pin </w:t>
-      </w:r>
-      <w:r>
-        <w:rPr>
-          <w:b/>
-          <w:sz w:val="20"/>
-        </w:rPr>
-        <w:t>Manual</w:t>
-      </w:r>
-      <w:r>
-        <w:rPr>
-          <w:b w:val="0"/>
-          <w:sz w:val="20"/>
-        </w:rPr>
-        <w:t xml:space="preserve"> just to see the caption change, then put it back to Assisted (or Use workspace default) so Features 11–12 still have a usable file.</w:t>
+        <w:t>Open the menu again only to read the other captions, then press Escape. Do not leave a live client file on Manual.</w:t>
       </w:r>
     </w:p>
     <w:p>
@@ -6688,7 +6954,7 @@
           <w:b w:val="0"/>
           <w:sz w:val="20"/>
         </w:rPr>
-        <w:t xml:space="preserve">Same file → </w:t>
+        <w:t xml:space="preserve">Same file → workbench tab </w:t>
       </w:r>
       <w:r>
         <w:rPr>
@@ -6702,7 +6968,50 @@
           <w:b w:val="0"/>
           <w:sz w:val="20"/>
         </w:rPr>
-        <w:t xml:space="preserve"> tab (the workbench tabs are Overview, Timeline, Compliance, Tasks, Documents, Contacts, Billing, Activity; Email and Agent appear when that workspace is on — there is no People tab)</w:t>
+        <w:t xml:space="preserve"> (next to Documents). Do </w:t>
+      </w:r>
+      <w:r>
+        <w:rPr>
+          <w:b/>
+          <w:sz w:val="20"/>
+        </w:rPr>
+        <w:t>not</w:t>
+      </w:r>
+      <w:r>
+        <w:rPr>
+          <w:b w:val="0"/>
+          <w:sz w:val="20"/>
+        </w:rPr>
+        <w:t xml:space="preserve"> use the sidebar item </w:t>
+      </w:r>
+      <w:r>
+        <w:rPr>
+          <w:b/>
+          <w:sz w:val="20"/>
+        </w:rPr>
+        <w:t>Contacts</w:t>
+      </w:r>
+      <w:r>
+        <w:rPr>
+          <w:b w:val="0"/>
+          <w:sz w:val="20"/>
+        </w:rPr>
+        <w:t xml:space="preserve"> — that is the workspace contact directory (</w:t>
+      </w:r>
+      <w:r>
+        <w:rPr>
+          <w:rFonts w:ascii="Consolas" w:hAnsi="Consolas"/>
+          <w:b w:val="0"/>
+          <w:sz w:val="20"/>
+        </w:rPr>
+        <w:t>/contacts</w:t>
+      </w:r>
+      <w:r>
+        <w:rPr>
+          <w:b w:val="0"/>
+          <w:sz w:val="20"/>
+        </w:rPr>
+        <w:t>), not this deal.</w:t>
       </w:r>
     </w:p>
     <w:p>
@@ -6734,7 +7043,7 @@
           <w:b w:val="0"/>
           <w:sz w:val="20"/>
         </w:rPr>
-        <w:t xml:space="preserve">Open </w:t>
+        <w:t xml:space="preserve">On the open file, click the workbench tab </w:t>
       </w:r>
       <w:r>
         <w:rPr>
@@ -6748,7 +7057,37 @@
           <w:b w:val="0"/>
           <w:sz w:val="20"/>
         </w:rPr>
-        <w:t xml:space="preserve">. The page heading is </w:t>
+        <w:t xml:space="preserve">. Confirm the URL stays on </w:t>
+      </w:r>
+      <w:r>
+        <w:rPr>
+          <w:rFonts w:ascii="Consolas" w:hAnsi="Consolas"/>
+          <w:b w:val="0"/>
+          <w:sz w:val="20"/>
+        </w:rPr>
+        <w:t>/transactions/…</w:t>
+      </w:r>
+      <w:r>
+        <w:rPr>
+          <w:b w:val="0"/>
+          <w:sz w:val="20"/>
+        </w:rPr>
+        <w:t xml:space="preserve"> (not </w:t>
+      </w:r>
+      <w:r>
+        <w:rPr>
+          <w:rFonts w:ascii="Consolas" w:hAnsi="Consolas"/>
+          <w:b w:val="0"/>
+          <w:sz w:val="20"/>
+        </w:rPr>
+        <w:t>/contacts</w:t>
+      </w:r>
+      <w:r>
+        <w:rPr>
+          <w:b w:val="0"/>
+          <w:sz w:val="20"/>
+        </w:rPr>
+        <w:t xml:space="preserve">). The page heading is </w:t>
       </w:r>
       <w:r>
         <w:rPr>
@@ -7106,7 +7445,22 @@
           <w:b w:val="0"/>
           <w:sz w:val="20"/>
         </w:rPr>
-        <w:t>Fail: the workspace tab is still labeled People; a Mail icon on Title when you never added a title email.</w:t>
+        <w:t>Fail: you landed on the sidebar Contacts directory (</w:t>
+      </w:r>
+      <w:r>
+        <w:rPr>
+          <w:rFonts w:ascii="Consolas" w:hAnsi="Consolas"/>
+          <w:b w:val="0"/>
+          <w:sz w:val="20"/>
+        </w:rPr>
+        <w:t>/contacts</w:t>
+      </w:r>
+      <w:r>
+        <w:rPr>
+          <w:b w:val="0"/>
+          <w:sz w:val="20"/>
+        </w:rPr>
+        <w:t>); a Mail icon on Title when you never added a title email.</w:t>
       </w:r>
     </w:p>
     <w:p>
@@ -7194,7 +7548,21 @@
           <w:b w:val="0"/>
           <w:sz w:val="20"/>
         </w:rPr>
-        <w:t xml:space="preserve"> tab</w:t>
+        <w:t xml:space="preserve"> tab. Folders are </w:t>
+      </w:r>
+      <w:r>
+        <w:rPr>
+          <w:b/>
+          <w:sz w:val="20"/>
+        </w:rPr>
+        <w:t>tabs</w:t>
+      </w:r>
+      <w:r>
+        <w:rPr>
+          <w:b w:val="0"/>
+          <w:sz w:val="20"/>
+        </w:rPr>
+        <w:t xml:space="preserve"> labeled Outbox, Sent, Inbox (not separate pages).</w:t>
       </w:r>
     </w:p>
     <w:p>
@@ -10160,7 +10528,7 @@
           <w:b w:val="0"/>
           <w:sz w:val="20"/>
         </w:rPr>
-        <w:t xml:space="preserve">Needs You / Why the AI is asking can say: *This deal is on Manual, so the AI will not send this email or complete this task on its own. Switch the deal off Manual, or complete it yourself.* Recovery: </w:t>
+        <w:t xml:space="preserve">Needs You / Why the AI is asking (white box) can say: *This deal is on Manual, so the AI will not send this email or complete this task on its own. Switch the deal off Manual, or complete it yourself.* The muted line under the box is shorter: *This deal is on Manual, so the AI will not send. Switch the deal off Manual, or complete the task yourself.* Recovery: </w:t>
       </w:r>
       <w:r>
         <w:rPr>
@@ -10534,24 +10902,17 @@
       </w:r>
       <w:r>
         <w:rPr>
-          <w:b w:val="0"/>
-          <w:sz w:val="20"/>
-        </w:rPr>
-        <w:t xml:space="preserve">After one Send from Complete this task: one message, right To, address + closing date in the body, </w:t>
-      </w:r>
-      <w:r>
-        <w:rPr>
-          <w:b/>
-          <w:sz w:val="20"/>
-        </w:rPr>
-        <w:t>agent’s</w:t>
-      </w:r>
-      <w:r>
-        <w:rPr>
-          <w:b w:val="0"/>
-          <w:sz w:val="20"/>
-        </w:rPr>
-        <w:t xml:space="preserve"> signature (your name), no “written by AI.” If the body says a file is attached, that file is on the email.</w:t>
+          <w:b/>
+          <w:sz w:val="20"/>
+        </w:rPr>
+        <w:t>Give this back to the AI</w:t>
+      </w:r>
+      <w:r>
+        <w:rPr>
+          <w:b w:val="0"/>
+          <w:sz w:val="20"/>
+        </w:rPr>
+        <w:t xml:space="preserve"> should not appear on that Assisted letter. If it does, do not click it; note Needs Work and use Send or close.</w:t>
       </w:r>
     </w:p>
     <w:p>
@@ -10571,6 +10932,40 @@
           <w:b w:val="0"/>
           <w:sz w:val="20"/>
         </w:rPr>
+        <w:t xml:space="preserve">After one Send from Complete this task: one message, right To, address + closing date in the body, </w:t>
+      </w:r>
+      <w:r>
+        <w:rPr>
+          <w:b/>
+          <w:sz w:val="20"/>
+        </w:rPr>
+        <w:t>agent’s</w:t>
+      </w:r>
+      <w:r>
+        <w:rPr>
+          <w:b w:val="0"/>
+          <w:sz w:val="20"/>
+        </w:rPr>
+        <w:t xml:space="preserve"> signature (your name), no “written by AI.” If the body says a file is attached, that file is on the email.</w:t>
+      </w:r>
+    </w:p>
+    <w:p>
+      <w:pPr>
+        <w:spacing w:after="40"/>
+        <w:ind w:left="357" w:hanging="255"/>
+      </w:pPr>
+      <w:r>
+        <w:rPr>
+          <w:b w:val="0"/>
+          <w:sz w:val="20"/>
+        </w:rPr>
+        <w:t xml:space="preserve">- </w:t>
+      </w:r>
+      <w:r>
+        <w:rPr>
+          <w:b w:val="0"/>
+          <w:sz w:val="20"/>
+        </w:rPr>
         <w:t>A Ready named-letter draft Aime prepared overnight (Intelligence → Email, not this dialog) may still sign as Aime when Aime signature is On. That is a different path. Note it; do not Fail Complete this task for it.</w:t>
       </w:r>
     </w:p>
@@ -11737,7 +12132,7 @@
           <w:b w:val="0"/>
           <w:sz w:val="20"/>
         </w:rPr>
-        <w:t xml:space="preserve">On Overnight, note Inspection reminders. It is </w:t>
+        <w:t>On Overnight, write down Inspection reminders as you find it (</w:t>
       </w:r>
       <w:r>
         <w:rPr>
@@ -11751,7 +12146,35 @@
           <w:b w:val="0"/>
           <w:sz w:val="20"/>
         </w:rPr>
-        <w:t xml:space="preserve"> unless you already turned it on.</w:t>
+        <w:t xml:space="preserve"> or </w:t>
+      </w:r>
+      <w:r>
+        <w:rPr>
+          <w:b/>
+          <w:sz w:val="20"/>
+        </w:rPr>
+        <w:t>Allowed</w:t>
+      </w:r>
+      <w:r>
+        <w:rPr>
+          <w:b w:val="0"/>
+          <w:sz w:val="20"/>
+        </w:rPr>
+        <w:t xml:space="preserve">). A workspace already in use may already be </w:t>
+      </w:r>
+      <w:r>
+        <w:rPr>
+          <w:b/>
+          <w:sz w:val="20"/>
+        </w:rPr>
+        <w:t>Allowed</w:t>
+      </w:r>
+      <w:r>
+        <w:rPr>
+          <w:b w:val="0"/>
+          <w:sz w:val="20"/>
+        </w:rPr>
+        <w:t>.</w:t>
       </w:r>
     </w:p>
     <w:p>
@@ -11771,7 +12194,7 @@
           <w:b w:val="0"/>
           <w:sz w:val="20"/>
         </w:rPr>
-        <w:t xml:space="preserve">Switch to </w:t>
+        <w:t xml:space="preserve">If it is Paused, switch to </w:t>
       </w:r>
       <w:r>
         <w:rPr>
@@ -11785,7 +12208,7 @@
           <w:b w:val="0"/>
           <w:sz w:val="20"/>
         </w:rPr>
-        <w:t>. You will switch it back when this feature is done.</w:t>
+        <w:t xml:space="preserve"> for this feature. You will restore the original setting when you finish.</w:t>
       </w:r>
     </w:p>
     <w:p>
@@ -11907,21 +12330,7 @@
           <w:b w:val="0"/>
           <w:sz w:val="20"/>
         </w:rPr>
-        <w:t xml:space="preserve">Set Inspection reminders back to </w:t>
-      </w:r>
-      <w:r>
-        <w:rPr>
-          <w:b/>
-          <w:sz w:val="20"/>
-        </w:rPr>
-        <w:t>Paused</w:t>
-      </w:r>
-      <w:r>
-        <w:rPr>
-          <w:b w:val="0"/>
-          <w:sz w:val="20"/>
-        </w:rPr>
-        <w:t>.</w:t>
+        <w:t>Put Inspection reminders back to what you wrote in step 1. Do not leave it Paused if it was already Allowed.</w:t>
       </w:r>
     </w:p>
     <w:p>
@@ -13071,6 +13480,27 @@
               </w:rPr>
               <w:t>Use today's date and retry</w:t>
             </w:r>
+            <w:r>
+              <w:rPr>
+                <w:b w:val="0"/>
+                <w:sz w:val="20"/>
+              </w:rPr>
+              <w:t xml:space="preserve">. There may also be </w:t>
+            </w:r>
+            <w:r>
+              <w:rPr>
+                <w:b/>
+                <w:sz w:val="20"/>
+              </w:rPr>
+              <w:t>Change due date</w:t>
+            </w:r>
+            <w:r>
+              <w:rPr>
+                <w:b w:val="0"/>
+                <w:sz w:val="20"/>
+              </w:rPr>
+              <w:t>, which opens Tasks.</w:t>
+            </w:r>
           </w:p>
         </w:tc>
         <w:tc>
@@ -13087,7 +13517,21 @@
                 <w:b w:val="0"/>
                 <w:sz w:val="20"/>
               </w:rPr>
-              <w:t>Click it. Due date moves to today. Nothing sends until the next run.</w:t>
+              <w:t xml:space="preserve">Click </w:t>
+            </w:r>
+            <w:r>
+              <w:rPr>
+                <w:b/>
+                <w:sz w:val="20"/>
+              </w:rPr>
+              <w:t>Use today's date and retry</w:t>
+            </w:r>
+            <w:r>
+              <w:rPr>
+                <w:b w:val="0"/>
+                <w:sz w:val="20"/>
+              </w:rPr>
+              <w:t>. Due date moves to today. Nothing sends until the next run.</w:t>
             </w:r>
           </w:p>
         </w:tc>
@@ -13255,7 +13699,21 @@
           <w:b w:val="0"/>
           <w:sz w:val="20"/>
         </w:rPr>
-        <w:t xml:space="preserve">Try now (this deal only) is Admin only. Toast example: “Tried this deal — Completed 0, flagged 1. Nothing else in the workspace was touched.” If the file is Autopilot and the block is cleared, this click </w:t>
+        <w:t xml:space="preserve">Try now (this deal only) is Admin only. Toast title </w:t>
+      </w:r>
+      <w:r>
+        <w:rPr>
+          <w:b/>
+          <w:sz w:val="20"/>
+        </w:rPr>
+        <w:t>Tried this deal</w:t>
+      </w:r>
+      <w:r>
+        <w:rPr>
+          <w:b w:val="0"/>
+          <w:sz w:val="20"/>
+        </w:rPr>
+        <w:t xml:space="preserve">. Description example: “Completed 0, flagged 1. Nothing else in the workspace was touched.” If the file is Autopilot and the block is cleared, this click </w:t>
       </w:r>
       <w:r>
         <w:rPr>
@@ -14431,7 +14889,21 @@
           <w:b w:val="0"/>
           <w:sz w:val="20"/>
         </w:rPr>
-        <w:t xml:space="preserve"> Preview next tick / Run AI tasks here. Under Automation rules, read </w:t>
+        <w:t xml:space="preserve"> Preview next tick / Run AI tasks here. On Automation rules, wait until the </w:t>
+      </w:r>
+      <w:r>
+        <w:rPr>
+          <w:b/>
+          <w:sz w:val="20"/>
+        </w:rPr>
+        <w:t>Ask me / Always</w:t>
+      </w:r>
+      <w:r>
+        <w:rPr>
+          <w:b w:val="0"/>
+          <w:sz w:val="20"/>
+        </w:rPr>
+        <w:t xml:space="preserve"> rows load (not a grey placeholder). Then read </w:t>
       </w:r>
       <w:r>
         <w:rPr>
@@ -14445,7 +14917,7 @@
           <w:b w:val="0"/>
           <w:sz w:val="20"/>
         </w:rPr>
-        <w:t xml:space="preserve"> — dates, waives, and send-email still need a person.</w:t>
+        <w:t xml:space="preserve"> — dates (cascade), auto-send email, waives, legal, and packet release still need a person.</w:t>
       </w:r>
     </w:p>
     <w:p>

</xml_diff>

<commit_message>
docs(help): rewrite Help Center source to as-built product copy
- Replace plan-based articles with copy grounded in the shipped frontend and backend
- Document the new needs-you article and the companion 20261004090000 migration
</commit_message>
<xml_diff>
--- a/AIME_AI_AUTOMATION_TESTING_GUIDELINES_2026-08-18.docx
+++ b/AIME_AI_AUTOMATION_TESTING_GUIDELINES_2026-08-18.docx
@@ -86,7 +86,7 @@
           <w:b w:val="0"/>
           <w:sz w:val="20"/>
         </w:rPr>
-        <w:t xml:space="preserve"> August 19, 2026 </w:t>
+        <w:t xml:space="preserve"> August 25, 2026 </w:t>
       </w:r>
       <w:r>
         <w:rPr>
@@ -142,7 +142,35 @@
           <w:b w:val="0"/>
           <w:sz w:val="20"/>
         </w:rPr>
-        <w:t xml:space="preserve"> with your own Velvet Elves account, in your own workspace</w:t>
+        <w:t xml:space="preserve"> with your own Velvet Elves account, in your own workspace </w:t>
+      </w:r>
+      <w:r>
+        <w:rPr>
+          <w:b/>
+          <w:sz w:val="20"/>
+        </w:rPr>
+        <w:t>This round:</w:t>
+      </w:r>
+      <w:r>
+        <w:rPr>
+          <w:b w:val="0"/>
+          <w:sz w:val="20"/>
+        </w:rPr>
+        <w:t xml:space="preserve"> the updated task library is on staging. Create </w:t>
+      </w:r>
+      <w:r>
+        <w:rPr>
+          <w:b/>
+          <w:sz w:val="20"/>
+        </w:rPr>
+        <w:t>new</w:t>
+      </w:r>
+      <w:r>
+        <w:rPr>
+          <w:b w:val="0"/>
+          <w:sz w:val="20"/>
+        </w:rPr>
+        <w:t xml:space="preserve"> files for Features 14 and 27–32. Open tasks on older files keep their old names, targets, and history until you complete them.</w:t>
       </w:r>
     </w:p>
     <w:p>
@@ -224,7 +252,7 @@
           <w:b w:val="0"/>
           <w:sz w:val="20"/>
         </w:rPr>
-        <w:t>Named letters (welcomes, title order, pending reminder, inspection deadline reminder)</w:t>
+        <w:t>Named letters that may send on Autopilot (welcomes, title order, pending reminder, inspection deadline reminder)</w:t>
       </w:r>
     </w:p>
     <w:p>
@@ -244,7 +272,21 @@
           <w:b w:val="0"/>
           <w:sz w:val="20"/>
         </w:rPr>
-        <w:t>Needs You, drafts, inbound mail, money, dates</w:t>
+        <w:t xml:space="preserve">The updated task library on </w:t>
+      </w:r>
+      <w:r>
+        <w:rPr>
+          <w:b/>
+          <w:sz w:val="20"/>
+        </w:rPr>
+        <w:t>new</w:t>
+      </w:r>
+      <w:r>
+        <w:rPr>
+          <w:b w:val="0"/>
+          <w:sz w:val="20"/>
+        </w:rPr>
+        <w:t xml:space="preserve"> files: Dual (Both), Order Title vs Confirm Title Order, cash appraisal split, Deliver Utility Info to the buyer’s agent, Order Home Warranty as an internal reminder, Closing Gift, no seller Inspection Completed</w:t>
       </w:r>
     </w:p>
     <w:p>
@@ -264,7 +306,27 @@
           <w:b w:val="0"/>
           <w:sz w:val="20"/>
         </w:rPr>
-        <w:t>Closing Disclosure on closing-information letters, Terminated vs Closed, cash appraisal recipients</w:t>
+        <w:t>Needs You, drafts, inbound mail, money, dates</w:t>
+      </w:r>
+    </w:p>
+    <w:p>
+      <w:pPr>
+        <w:spacing w:after="40"/>
+        <w:ind w:left="357" w:hanging="255"/>
+      </w:pPr>
+      <w:r>
+        <w:rPr>
+          <w:b w:val="0"/>
+          <w:sz w:val="20"/>
+        </w:rPr>
+        <w:t xml:space="preserve">- </w:t>
+      </w:r>
+      <w:r>
+        <w:rPr>
+          <w:b w:val="0"/>
+          <w:sz w:val="20"/>
+        </w:rPr>
+        <w:t>Closing Disclosure on closing-information letters, Terminated vs Closed</w:t>
       </w:r>
     </w:p>
     <w:p>
@@ -1291,6 +1353,168 @@
           </w:p>
         </w:tc>
       </w:tr>
+      <w:tr>
+        <w:tc>
+          <w:tcPr>
+            <w:tcW w:type="dxa" w:w="2340"/>
+          </w:tcPr>
+          <w:p>
+            <w:pPr>
+              <w:spacing w:after="0"/>
+            </w:pPr>
+            <w:r/>
+            <w:r>
+              <w:rPr>
+                <w:b w:val="0"/>
+                <w:sz w:val="20"/>
+              </w:rPr>
+              <w:t>700 Test Dual Ave</w:t>
+            </w:r>
+          </w:p>
+        </w:tc>
+        <w:tc>
+          <w:tcPr>
+            <w:tcW w:type="dxa" w:w="2340"/>
+          </w:tcPr>
+          <w:p>
+            <w:pPr>
+              <w:spacing w:after="0"/>
+            </w:pPr>
+            <w:r/>
+            <w:r>
+              <w:rPr>
+                <w:b w:val="0"/>
+                <w:sz w:val="20"/>
+              </w:rPr>
+              <w:t xml:space="preserve">Buyer </w:t>
+            </w:r>
+            <w:r>
+              <w:rPr>
+                <w:b/>
+                <w:sz w:val="20"/>
+              </w:rPr>
+              <w:t>and</w:t>
+            </w:r>
+            <w:r>
+              <w:rPr>
+                <w:b w:val="0"/>
+                <w:sz w:val="20"/>
+              </w:rPr>
+              <w:t xml:space="preserve"> seller (Both), financed, Contacts has emails you own</w:t>
+            </w:r>
+          </w:p>
+        </w:tc>
+        <w:tc>
+          <w:tcPr>
+            <w:tcW w:type="dxa" w:w="2340"/>
+          </w:tcPr>
+          <w:p>
+            <w:pPr>
+              <w:spacing w:after="0"/>
+            </w:pPr>
+            <w:r/>
+            <w:r>
+              <w:rPr>
+                <w:b w:val="0"/>
+                <w:sz w:val="20"/>
+              </w:rPr>
+              <w:t>Assisted</w:t>
+            </w:r>
+          </w:p>
+        </w:tc>
+        <w:tc>
+          <w:tcPr>
+            <w:tcW w:type="dxa" w:w="2340"/>
+          </w:tcPr>
+          <w:p>
+            <w:pPr>
+              <w:spacing w:after="0"/>
+            </w:pPr>
+            <w:r/>
+            <w:r>
+              <w:rPr>
+                <w:b w:val="0"/>
+                <w:sz w:val="20"/>
+              </w:rPr>
+              <w:t>Feature 28 Dual</w:t>
+            </w:r>
+          </w:p>
+        </w:tc>
+      </w:tr>
+      <w:tr>
+        <w:tc>
+          <w:tcPr>
+            <w:tcW w:type="dxa" w:w="2340"/>
+          </w:tcPr>
+          <w:p>
+            <w:pPr>
+              <w:spacing w:after="0"/>
+            </w:pPr>
+            <w:r/>
+            <w:r>
+              <w:rPr>
+                <w:b w:val="0"/>
+                <w:sz w:val="20"/>
+              </w:rPr>
+              <w:t>800 Test Utility Ln</w:t>
+            </w:r>
+          </w:p>
+        </w:tc>
+        <w:tc>
+          <w:tcPr>
+            <w:tcW w:type="dxa" w:w="2340"/>
+          </w:tcPr>
+          <w:p>
+            <w:pPr>
+              <w:spacing w:after="0"/>
+            </w:pPr>
+            <w:r/>
+            <w:r>
+              <w:rPr>
+                <w:b w:val="0"/>
+                <w:sz w:val="20"/>
+              </w:rPr>
+              <w:t>Seller, financed, utility information uploaded on Documents</w:t>
+            </w:r>
+          </w:p>
+        </w:tc>
+        <w:tc>
+          <w:tcPr>
+            <w:tcW w:type="dxa" w:w="2340"/>
+          </w:tcPr>
+          <w:p>
+            <w:pPr>
+              <w:spacing w:after="0"/>
+            </w:pPr>
+            <w:r/>
+            <w:r>
+              <w:rPr>
+                <w:b w:val="0"/>
+                <w:sz w:val="20"/>
+              </w:rPr>
+              <w:t>Assisted</w:t>
+            </w:r>
+          </w:p>
+        </w:tc>
+        <w:tc>
+          <w:tcPr>
+            <w:tcW w:type="dxa" w:w="2340"/>
+          </w:tcPr>
+          <w:p>
+            <w:pPr>
+              <w:spacing w:after="0"/>
+            </w:pPr>
+            <w:r/>
+            <w:r>
+              <w:rPr>
+                <w:b w:val="0"/>
+                <w:sz w:val="20"/>
+              </w:rPr>
+              <w:t>Feature 30 Deliver Utility Info</w:t>
+            </w:r>
+          </w:p>
+        </w:tc>
+      </w:tr>
     </w:tbl>
     <w:p/>
     <w:p>
@@ -1302,7 +1526,7 @@
           <w:b w:val="0"/>
           <w:sz w:val="20"/>
         </w:rPr>
-        <w:t>You do not have to create all six on day one. Create 100 Test Oak Lane first. Add the others when you reach that feature.</w:t>
+        <w:t>You do not have to create every file on day one. Create 100 Test Oak Lane first. Add Dual, cash, and listing files when you reach those features.</w:t>
       </w:r>
     </w:p>
     <w:p>
@@ -1409,7 +1633,35 @@
           <w:b w:val="0"/>
           <w:sz w:val="20"/>
         </w:rPr>
-        <w:t>Extra named letters beyond welcome, title-order, and inspection-reminder. Do not invent new letters that should send without a tap.</w:t>
+        <w:t xml:space="preserve">Request / deliver / Clear to Close / Closing Disclosure check / closing-information / Request Testimonials sending </w:t>
+      </w:r>
+      <w:r>
+        <w:rPr>
+          <w:b/>
+          <w:sz w:val="20"/>
+        </w:rPr>
+        <w:t>without a tap</w:t>
+      </w:r>
+      <w:r>
+        <w:rPr>
+          <w:b w:val="0"/>
+          <w:sz w:val="20"/>
+        </w:rPr>
+        <w:t xml:space="preserve">. Those Autopilot letters are not authorized yet. Welcomes, title-order, pending reminder, and inspection </w:t>
+      </w:r>
+      <w:r>
+        <w:rPr>
+          <w:b/>
+          <w:sz w:val="20"/>
+        </w:rPr>
+        <w:t>deadline</w:t>
+      </w:r>
+      <w:r>
+        <w:rPr>
+          <w:b w:val="0"/>
+          <w:sz w:val="20"/>
+        </w:rPr>
+        <w:t xml:space="preserve"> reminder still may send on Autopilot.</w:t>
       </w:r>
     </w:p>
     <w:p>
@@ -1429,7 +1681,7 @@
           <w:b w:val="0"/>
           <w:sz w:val="20"/>
         </w:rPr>
-        <w:t>Buyers and sellers talking to Aime. Clients keep asking the team. A client-facing Aime chat is a fail if you see one.</w:t>
+        <w:t>Next-day 10am follow-up, or daily “step in” nags three days before a request is due. Not built.</w:t>
       </w:r>
     </w:p>
     <w:p>
@@ -1449,7 +1701,7 @@
           <w:b w:val="0"/>
           <w:sz w:val="20"/>
         </w:rPr>
-        <w:t>A later amendment changing a date ("the file used to say X; this later signed document says Y"). Not shipped.</w:t>
+        <w:t>A December 1 year-end exemption blast (1010). Not built.</w:t>
       </w:r>
     </w:p>
     <w:p>
@@ -1469,7 +1721,7 @@
           <w:b w:val="0"/>
           <w:sz w:val="20"/>
         </w:rPr>
-        <w:t>A countdown that then sends mail. Not built.</w:t>
+        <w:t>A lien / judgment “cloud summary” in Deliver Title. The title commitment may still go out; the cloud list is later.</w:t>
       </w:r>
     </w:p>
     <w:p>
@@ -1489,7 +1741,157 @@
           <w:b w:val="0"/>
           <w:sz w:val="20"/>
         </w:rPr>
+        <w:t>Buyers and sellers talking to Aime. Clients keep asking the team. A client-facing Aime chat is a fail if you see one.</w:t>
+      </w:r>
+    </w:p>
+    <w:p>
+      <w:pPr>
+        <w:spacing w:after="40"/>
+        <w:ind w:left="357" w:hanging="255"/>
+      </w:pPr>
+      <w:r>
+        <w:rPr>
+          <w:b w:val="0"/>
+          <w:sz w:val="20"/>
+        </w:rPr>
+        <w:t xml:space="preserve">- </w:t>
+      </w:r>
+      <w:r>
+        <w:rPr>
+          <w:b w:val="0"/>
+          <w:sz w:val="20"/>
+        </w:rPr>
+        <w:t>A later amendment changing a date ("the file used to say X; this later signed document says Y"). Not shipped.</w:t>
+      </w:r>
+    </w:p>
+    <w:p>
+      <w:pPr>
+        <w:spacing w:after="40"/>
+        <w:ind w:left="357" w:hanging="255"/>
+      </w:pPr>
+      <w:r>
+        <w:rPr>
+          <w:b w:val="0"/>
+          <w:sz w:val="20"/>
+        </w:rPr>
+        <w:t xml:space="preserve">- </w:t>
+      </w:r>
+      <w:r>
+        <w:rPr>
+          <w:b w:val="0"/>
+          <w:sz w:val="20"/>
+        </w:rPr>
+        <w:t>A countdown that then sends mail. Not built.</w:t>
+      </w:r>
+    </w:p>
+    <w:p>
+      <w:pPr>
+        <w:spacing w:after="40"/>
+        <w:ind w:left="357" w:hanging="255"/>
+      </w:pPr>
+      <w:r>
+        <w:rPr>
+          <w:b w:val="0"/>
+          <w:sz w:val="20"/>
+        </w:rPr>
+        <w:t xml:space="preserve">- </w:t>
+      </w:r>
+      <w:r>
+        <w:rPr>
+          <w:b w:val="0"/>
+          <w:sz w:val="20"/>
+        </w:rPr>
         <w:t>Listing or marketing after a fallen-through deal.</w:t>
+      </w:r>
+    </w:p>
+    <w:p>
+      <w:pPr>
+        <w:spacing w:after="40"/>
+        <w:ind w:left="357" w:hanging="255"/>
+      </w:pPr>
+      <w:r>
+        <w:rPr>
+          <w:b w:val="0"/>
+          <w:sz w:val="20"/>
+        </w:rPr>
+        <w:t xml:space="preserve">- </w:t>
+      </w:r>
+      <w:r>
+        <w:rPr>
+          <w:b w:val="0"/>
+          <w:sz w:val="20"/>
+        </w:rPr>
+        <w:t xml:space="preserve">Spreadsheet numbers from 360 onward on the screen. The work follows the updated list; the </w:t>
+      </w:r>
+      <w:r>
+        <w:rPr>
+          <w:b/>
+          <w:sz w:val="20"/>
+        </w:rPr>
+        <w:t>number on the task stays the live ID</w:t>
+      </w:r>
+      <w:r>
+        <w:rPr>
+          <w:b w:val="0"/>
+          <w:sz w:val="20"/>
+        </w:rPr>
+        <w:t xml:space="preserve"> (for example Closing Gift stays </w:t>
+      </w:r>
+      <w:r>
+        <w:rPr>
+          <w:b/>
+          <w:sz w:val="20"/>
+        </w:rPr>
+        <w:t>370</w:t>
+      </w:r>
+      <w:r>
+        <w:rPr>
+          <w:b w:val="0"/>
+          <w:sz w:val="20"/>
+        </w:rPr>
+        <w:t xml:space="preserve">, lockbox / MLS Sold stay </w:t>
+      </w:r>
+      <w:r>
+        <w:rPr>
+          <w:b/>
+          <w:sz w:val="20"/>
+        </w:rPr>
+        <w:t>453</w:t>
+      </w:r>
+      <w:r>
+        <w:rPr>
+          <w:b w:val="0"/>
+          <w:sz w:val="20"/>
+        </w:rPr>
+        <w:t xml:space="preserve"> / </w:t>
+      </w:r>
+      <w:r>
+        <w:rPr>
+          <w:b/>
+          <w:sz w:val="20"/>
+        </w:rPr>
+        <w:t>455</w:t>
+      </w:r>
+      <w:r>
+        <w:rPr>
+          <w:b w:val="0"/>
+          <w:sz w:val="20"/>
+        </w:rPr>
+        <w:t xml:space="preserve">, seller Inspection Negotiated stays </w:t>
+      </w:r>
+      <w:r>
+        <w:rPr>
+          <w:b/>
+          <w:sz w:val="20"/>
+        </w:rPr>
+        <w:t>257</w:t>
+      </w:r>
+      <w:r>
+        <w:rPr>
+          <w:b w:val="0"/>
+          <w:sz w:val="20"/>
+        </w:rPr>
+        <w:t>).</w:t>
       </w:r>
     </w:p>
     <w:p>
@@ -2066,10 +2468,17 @@
       </w:r>
       <w:r>
         <w:rPr>
-          <w:b w:val="0"/>
-          <w:sz w:val="20"/>
-        </w:rPr>
-        <w:t>Cash files (500 / 600) for appraisal recipients</w:t>
+          <w:b/>
+          <w:sz w:val="20"/>
+        </w:rPr>
+        <w:t>New</w:t>
+      </w:r>
+      <w:r>
+        <w:rPr>
+          <w:b w:val="0"/>
+          <w:sz w:val="20"/>
+        </w:rPr>
+        <w:t xml:space="preserve"> files for the updated library: Dual (700), title 70 vs 80, listing utility (800), Order Home Warranty, cash appraisal (500 / 600)</w:t>
       </w:r>
     </w:p>
     <w:p>
@@ -2089,7 +2498,7 @@
           <w:b w:val="0"/>
           <w:sz w:val="20"/>
         </w:rPr>
-        <w:t>Named letters on 200 / 300 / 400 (Manual, Autopilot, missing email)</w:t>
+        <w:t>Named letters on 200 / 300 / 400 (Manual, Autopilot, missing email) — still only the authorized Autopilot set</w:t>
       </w:r>
     </w:p>
     <w:p>
@@ -9591,7 +10000,21 @@
           <w:b w:val="0"/>
           <w:sz w:val="20"/>
         </w:rPr>
-        <w:t xml:space="preserve"> represent Buyer &amp; Seller, cash, appraisal Yes. Expect the same To as Buy-Cash.</w:t>
+        <w:t xml:space="preserve"> represent Buyer &amp; Seller, cash, appraisal Yes. Expect the same To as Buy-Cash (buyer). Do </w:t>
+      </w:r>
+      <w:r>
+        <w:rPr>
+          <w:b/>
+          <w:sz w:val="20"/>
+        </w:rPr>
+        <w:t>not</w:t>
+      </w:r>
+      <w:r>
+        <w:rPr>
+          <w:b w:val="0"/>
+          <w:sz w:val="20"/>
+        </w:rPr>
+        <w:t xml:space="preserve"> expect a co-op appraisal letter on Dual — there is no co-op on a Both file.</w:t>
       </w:r>
     </w:p>
     <w:p>
@@ -9623,7 +10046,35 @@
           <w:b w:val="0"/>
           <w:sz w:val="20"/>
         </w:rPr>
-        <w:t xml:space="preserve">Buy-Cash and Both-Cash: </w:t>
+        <w:t xml:space="preserve">Buy-Cash: </w:t>
+      </w:r>
+      <w:r>
+        <w:rPr>
+          <w:b/>
+          <w:sz w:val="20"/>
+        </w:rPr>
+        <w:t>Appraisal Ordered</w:t>
+      </w:r>
+      <w:r>
+        <w:rPr>
+          <w:b w:val="0"/>
+          <w:sz w:val="20"/>
+        </w:rPr>
+        <w:t xml:space="preserve"> and </w:t>
+      </w:r>
+      <w:r>
+        <w:rPr>
+          <w:b/>
+          <w:sz w:val="20"/>
+        </w:rPr>
+        <w:t>Appraisal Completed</w:t>
+      </w:r>
+      <w:r>
+        <w:rPr>
+          <w:b w:val="0"/>
+          <w:sz w:val="20"/>
+        </w:rPr>
+        <w:t xml:space="preserve"> (live IDs 265 / 271). </w:t>
       </w:r>
       <w:r>
         <w:rPr>
@@ -9672,7 +10123,49 @@
           <w:b w:val="0"/>
           <w:sz w:val="20"/>
         </w:rPr>
-        <w:t xml:space="preserve">Sell-Cash: </w:t>
+        <w:t xml:space="preserve">Sell-Cash: the same </w:t>
+      </w:r>
+      <w:r>
+        <w:rPr>
+          <w:b/>
+          <w:sz w:val="20"/>
+        </w:rPr>
+        <w:t>names</w:t>
+      </w:r>
+      <w:r>
+        <w:rPr>
+          <w:b w:val="0"/>
+          <w:sz w:val="20"/>
+        </w:rPr>
+        <w:t xml:space="preserve"> on Tasks, live IDs </w:t>
+      </w:r>
+      <w:r>
+        <w:rPr>
+          <w:b/>
+          <w:sz w:val="20"/>
+        </w:rPr>
+        <w:t>267</w:t>
+      </w:r>
+      <w:r>
+        <w:rPr>
+          <w:b w:val="0"/>
+          <w:sz w:val="20"/>
+        </w:rPr>
+        <w:t xml:space="preserve"> / </w:t>
+      </w:r>
+      <w:r>
+        <w:rPr>
+          <w:b/>
+          <w:sz w:val="20"/>
+        </w:rPr>
+        <w:t>275</w:t>
+      </w:r>
+      <w:r>
+        <w:rPr>
+          <w:b w:val="0"/>
+          <w:sz w:val="20"/>
+        </w:rPr>
+        <w:t xml:space="preserve">. </w:t>
       </w:r>
       <w:r>
         <w:rPr>
@@ -9740,7 +10233,7 @@
           <w:b w:val="0"/>
           <w:sz w:val="20"/>
         </w:rPr>
-        <w:t>Fail: To is empty; To is the other side’s client on a listing; the task is missing even though you chose Yes — buyer is appraising.</w:t>
+        <w:t>Fail: To is empty; To is the other side’s client on a listing; Buy-Cash still emails the co-op; Sell-Cash still emails the buyer; the task is missing even though you chose Yes — buyer is appraising.</w:t>
       </w:r>
     </w:p>
     <w:p>
@@ -10107,7 +10600,35 @@
                 <w:b w:val="0"/>
                 <w:sz w:val="20"/>
               </w:rPr>
-              <w:t>Email and the purchase agreement. If title is already ordered, Confirm Title Order marks done — it does not mail twice</w:t>
+              <w:t xml:space="preserve">Email and the purchase agreement. Wizard chooses </w:t>
+            </w:r>
+            <w:r>
+              <w:rPr>
+                <w:b/>
+                <w:sz w:val="20"/>
+              </w:rPr>
+              <w:t>Order Title</w:t>
+            </w:r>
+            <w:r>
+              <w:rPr>
+                <w:b w:val="0"/>
+                <w:sz w:val="20"/>
+              </w:rPr>
+              <w:t xml:space="preserve"> when your side orders title, </w:t>
+            </w:r>
+            <w:r>
+              <w:rPr>
+                <w:b/>
+                <w:sz w:val="20"/>
+              </w:rPr>
+              <w:t>Confirm Title Order</w:t>
+            </w:r>
+            <w:r>
+              <w:rPr>
+                <w:b w:val="0"/>
+                <w:sz w:val="20"/>
+              </w:rPr>
+              <w:t xml:space="preserve"> when the co-op orders. Confirm Title Order is the courtesy-order letter (“as a courtesy to … engage you as the escrow agent”), not a “has title been ordered?” follow-up. Both withhold personal-property and monetary addenda / amendments.</w:t>
             </w:r>
           </w:p>
         </w:tc>
@@ -10261,7 +10782,21 @@
           <w:b w:val="0"/>
           <w:sz w:val="20"/>
         </w:rPr>
-        <w:t>Order Home Warranty is drafted for you to send. It does not send on its own.</w:t>
+        <w:t xml:space="preserve">Order Home Warranty is an </w:t>
+      </w:r>
+      <w:r>
+        <w:rPr>
+          <w:b/>
+          <w:sz w:val="20"/>
+        </w:rPr>
+        <w:t>internal reminder</w:t>
+      </w:r>
+      <w:r>
+        <w:rPr>
+          <w:b w:val="0"/>
+          <w:sz w:val="20"/>
+        </w:rPr>
+        <w:t xml:space="preserve"> to the transaction agent (TC on copy when assigned). It is drafted for you to send. It does not email a warranty company, and it does not send on its own.</w:t>
       </w:r>
     </w:p>
     <w:p>
@@ -11385,7 +11920,7 @@
           <w:b w:val="0"/>
           <w:sz w:val="20"/>
         </w:rPr>
-        <w:t>At most one of each letter. Confirm Title Order does not mail again if title is already ordered.</w:t>
+        <w:t>Order Title / Confirm Title Order must not attach personal-property or monetary addenda / amendments even when those files are on Documents.</w:t>
       </w:r>
     </w:p>
     <w:p>
@@ -11405,21 +11940,21 @@
           <w:b w:val="0"/>
           <w:sz w:val="20"/>
         </w:rPr>
-        <w:t xml:space="preserve">Automatic named letters sign as </w:t>
-      </w:r>
-      <w:r>
-        <w:rPr>
-          <w:b/>
-          <w:sz w:val="20"/>
-        </w:rPr>
-        <w:t>Aime, Assistant to the agent</w:t>
-      </w:r>
-      <w:r>
-        <w:rPr>
-          <w:b w:val="0"/>
-          <w:sz w:val="20"/>
-        </w:rPr>
-        <w:t xml:space="preserve"> when Aime signature is On.</w:t>
+        <w:t xml:space="preserve">At most one of each letter. The wizard picks Order Title </w:t>
+      </w:r>
+      <w:r>
+        <w:rPr>
+          <w:b/>
+          <w:sz w:val="20"/>
+        </w:rPr>
+        <w:t>or</w:t>
+      </w:r>
+      <w:r>
+        <w:rPr>
+          <w:b w:val="0"/>
+          <w:sz w:val="20"/>
+        </w:rPr>
+        <w:t xml:space="preserve"> Confirm Title Order, not both.</w:t>
       </w:r>
     </w:p>
     <w:p>
@@ -11439,7 +11974,21 @@
           <w:b w:val="0"/>
           <w:sz w:val="20"/>
         </w:rPr>
-        <w:t>Fail: second welcome; letter to someone not on Contacts; Order Title sent with no purchase agreement.</w:t>
+        <w:t xml:space="preserve">Automatic named letters sign as </w:t>
+      </w:r>
+      <w:r>
+        <w:rPr>
+          <w:b/>
+          <w:sz w:val="20"/>
+        </w:rPr>
+        <w:t>Aime, Assistant to the agent</w:t>
+      </w:r>
+      <w:r>
+        <w:rPr>
+          <w:b w:val="0"/>
+          <w:sz w:val="20"/>
+        </w:rPr>
+        <w:t xml:space="preserve"> when Aime signature is On.</w:t>
       </w:r>
     </w:p>
     <w:p>
@@ -11459,6 +12008,26 @@
           <w:b w:val="0"/>
           <w:sz w:val="20"/>
         </w:rPr>
+        <w:t>Fail: second welcome; letter to someone not on Contacts; Order Title sent with no purchase agreement.</w:t>
+      </w:r>
+    </w:p>
+    <w:p>
+      <w:pPr>
+        <w:spacing w:after="40"/>
+        <w:ind w:left="357" w:hanging="255"/>
+      </w:pPr>
+      <w:r>
+        <w:rPr>
+          <w:b w:val="0"/>
+          <w:sz w:val="20"/>
+        </w:rPr>
+        <w:t xml:space="preserve">- </w:t>
+      </w:r>
+      <w:r>
+        <w:rPr>
+          <w:b w:val="0"/>
+          <w:sz w:val="20"/>
+        </w:rPr>
         <w:t>Paused / Terminated / Completed / Closed files are not in would-send.</w:t>
       </w:r>
     </w:p>
@@ -12399,10 +12968,17 @@
       </w:r>
       <w:r>
         <w:rPr>
-          <w:b w:val="0"/>
-          <w:sz w:val="20"/>
-        </w:rPr>
-        <w:t>Inspection Negotiated (or similar) does not send on its own.</w:t>
+          <w:b/>
+          <w:sz w:val="20"/>
+        </w:rPr>
+        <w:t>Inspection Negotiated</w:t>
+      </w:r>
+      <w:r>
+        <w:rPr>
+          <w:b w:val="0"/>
+          <w:sz w:val="20"/>
+        </w:rPr>
+        <w:t xml:space="preserve"> does not send on its own in this round (Aime is an intermediary when you open the plan — it does not propose repair terms).</w:t>
       </w:r>
     </w:p>
     <w:p>
@@ -12422,6 +12998,54 @@
           <w:b w:val="0"/>
           <w:sz w:val="20"/>
         </w:rPr>
+        <w:t xml:space="preserve">On a Dual (Both) </w:t>
+      </w:r>
+      <w:r>
+        <w:rPr>
+          <w:b/>
+          <w:sz w:val="20"/>
+        </w:rPr>
+        <w:t>new</w:t>
+      </w:r>
+      <w:r>
+        <w:rPr>
+          <w:b w:val="0"/>
+          <w:sz w:val="20"/>
+        </w:rPr>
+        <w:t xml:space="preserve"> file you should see </w:t>
+      </w:r>
+      <w:r>
+        <w:rPr>
+          <w:b/>
+          <w:sz w:val="20"/>
+        </w:rPr>
+        <w:t>both</w:t>
+      </w:r>
+      <w:r>
+        <w:rPr>
+          <w:b w:val="0"/>
+          <w:sz w:val="20"/>
+        </w:rPr>
+        <w:t xml:space="preserve"> the buyer and seller Inspection Response Reminder and Inspection Negotiated rows (Feature 28). A listing-only file gets the seller pair; a buyer-only file gets the buyer pair.</w:t>
+      </w:r>
+    </w:p>
+    <w:p>
+      <w:pPr>
+        <w:spacing w:after="40"/>
+        <w:ind w:left="357" w:hanging="255"/>
+      </w:pPr>
+      <w:r>
+        <w:rPr>
+          <w:b w:val="0"/>
+          <w:sz w:val="20"/>
+        </w:rPr>
+        <w:t xml:space="preserve">- </w:t>
+      </w:r>
+      <w:r>
+        <w:rPr>
+          <w:b w:val="0"/>
+          <w:sz w:val="20"/>
+        </w:rPr>
         <w:t>If you leave the switch Paused, the task is flagged that inspection response reminders are paused. That is not a Fail.</w:t>
       </w:r>
     </w:p>
@@ -13063,7 +13687,7 @@
           <w:b w:val="0"/>
           <w:sz w:val="20"/>
         </w:rPr>
-        <w:t>Order Home Warranty may appear as a draft; it must not auto-send.</w:t>
+        <w:t>Order Home Warranty may appear as a draft; it must not auto-send. To should be the transaction agent (you), not a warranty company.</w:t>
       </w:r>
     </w:p>
     <w:p>
@@ -15097,7 +15721,7 @@
           <w:b w:val="0"/>
           <w:sz w:val="20"/>
         </w:rPr>
-        <w:t>The surfaces you already opened: Settings → AI &amp; Automation, Needs You, Confirm Details, 100 Test Oak Lane Email and Tasks</w:t>
+        <w:t>The surfaces you already opened: Settings → AI &amp; Automation, Needs You, Confirm Details, 100 Test Oak Lane Email and Tasks, plus any Dual / title / warranty files from Section 6</w:t>
       </w:r>
     </w:p>
     <w:p>
@@ -15129,7 +15753,7 @@
           <w:b w:val="0"/>
           <w:sz w:val="20"/>
         </w:rPr>
-        <w:t>You do not need a special hunt. While you work Features 1–25, jot anything that matches the fail list.</w:t>
+        <w:t>You do not need a special hunt. While you work Features 1–32, jot anything that matches the fail list.</w:t>
       </w:r>
     </w:p>
     <w:p>
@@ -15348,6 +15972,2089 @@
           <w:sz w:val="20"/>
         </w:rPr>
         <w:t>Fallen-through deals filed as Closed with no Terminated path</w:t>
+      </w:r>
+    </w:p>
+    <w:p>
+      <w:pPr>
+        <w:spacing w:after="40"/>
+        <w:ind w:left="357" w:hanging="255"/>
+      </w:pPr>
+      <w:r>
+        <w:rPr>
+          <w:b w:val="0"/>
+          <w:sz w:val="20"/>
+        </w:rPr>
+        <w:t xml:space="preserve">- </w:t>
+      </w:r>
+      <w:r>
+        <w:rPr>
+          <w:b w:val="0"/>
+          <w:sz w:val="20"/>
+        </w:rPr>
+        <w:t>Confirm Title Order still written as “has title been ordered?” instead of a courtesy order when the co-op is ordering</w:t>
+      </w:r>
+    </w:p>
+    <w:p>
+      <w:pPr>
+        <w:spacing w:after="40"/>
+        <w:ind w:left="357" w:hanging="255"/>
+      </w:pPr>
+      <w:r>
+        <w:rPr>
+          <w:b w:val="0"/>
+          <w:sz w:val="20"/>
+        </w:rPr>
+        <w:t xml:space="preserve">- </w:t>
+      </w:r>
+      <w:r>
+        <w:rPr>
+          <w:b w:val="0"/>
+          <w:sz w:val="20"/>
+        </w:rPr>
+        <w:t>Dual (Both) new file missing the seller Inspection Response Reminder or Inspection Negotiated, or still generating a co-op welcome</w:t>
+      </w:r>
+    </w:p>
+    <w:p>
+      <w:pPr>
+        <w:spacing w:after="80"/>
+      </w:pPr>
+      <w:r>
+        <w:rPr>
+          <w:b/>
+          <w:sz w:val="20"/>
+        </w:rPr>
+        <w:t>Feedback</w:t>
+      </w:r>
+    </w:p>
+    <w:p>
+      <w:pPr>
+        <w:spacing w:after="80"/>
+      </w:pPr>
+      <w:r>
+        <w:rPr>
+          <w:b w:val="0"/>
+          <w:sz w:val="20"/>
+        </w:rPr>
+        <w:t>_Please note: Status (Pass / Fail / Needs Work), and any comments or issues you hit._</w:t>
+      </w:r>
+    </w:p>
+    <w:p>
+      <w:pPr>
+        <w:spacing w:after="80"/>
+      </w:pPr>
+      <w:r>
+        <w:rPr>
+          <w:b w:val="0"/>
+          <w:sz w:val="20"/>
+        </w:rPr>
+        <w:t>&gt; _Status:_ &gt; &gt; _Comments:_</w:t>
+      </w:r>
+    </w:p>
+    <w:p>
+      <w:pPr>
+        <w:spacing w:after="120"/>
+      </w:pPr>
+    </w:p>
+    <w:p>
+      <w:pPr>
+        <w:pStyle w:val="Heading1"/>
+        <w:spacing w:after="120" w:before="360"/>
+      </w:pPr>
+      <w:r>
+        <w:t>Section 6 — Updated task library (new files)</w:t>
+      </w:r>
+    </w:p>
+    <w:p>
+      <w:pPr>
+        <w:spacing w:after="80"/>
+      </w:pPr>
+      <w:r>
+        <w:rPr>
+          <w:b w:val="0"/>
+          <w:sz w:val="20"/>
+        </w:rPr>
+        <w:t xml:space="preserve">Use a </w:t>
+      </w:r>
+      <w:r>
+        <w:rPr>
+          <w:b/>
+          <w:sz w:val="20"/>
+        </w:rPr>
+        <w:t>new</w:t>
+      </w:r>
+      <w:r>
+        <w:rPr>
+          <w:b w:val="0"/>
+          <w:sz w:val="20"/>
+        </w:rPr>
+        <w:t xml:space="preserve"> transaction for each of these. Older open tasks can still show yesterday’s target and copy — that is expected. The number on the row is the live ID (not the spreadsheet number from 360 onward).</w:t>
+      </w:r>
+    </w:p>
+    <w:p>
+      <w:pPr>
+        <w:pStyle w:val="Heading2"/>
+        <w:spacing w:after="80" w:before="240"/>
+      </w:pPr>
+      <w:r>
+        <w:t>27. Live IDs stay; Closing Gift is one row</w:t>
+      </w:r>
+    </w:p>
+    <w:p>
+      <w:pPr>
+        <w:spacing w:after="80"/>
+      </w:pPr>
+      <w:r>
+        <w:rPr>
+          <w:b/>
+          <w:sz w:val="20"/>
+        </w:rPr>
+        <w:t>Route / Location</w:t>
+      </w:r>
+    </w:p>
+    <w:p>
+      <w:pPr>
+        <w:spacing w:after="80"/>
+      </w:pPr>
+      <w:r>
+        <w:rPr>
+          <w:b w:val="0"/>
+          <w:sz w:val="20"/>
+        </w:rPr>
+        <w:t xml:space="preserve">New Buyer financed file and new Seller financed file → </w:t>
+      </w:r>
+      <w:r>
+        <w:rPr>
+          <w:b/>
+          <w:sz w:val="20"/>
+        </w:rPr>
+        <w:t>Tasks</w:t>
+      </w:r>
+    </w:p>
+    <w:p>
+      <w:pPr>
+        <w:spacing w:after="80"/>
+      </w:pPr>
+      <w:r>
+        <w:rPr>
+          <w:b/>
+          <w:sz w:val="20"/>
+        </w:rPr>
+        <w:t>How To Test</w:t>
+      </w:r>
+    </w:p>
+    <w:p>
+      <w:pPr>
+        <w:spacing w:after="40"/>
+        <w:ind w:left="357" w:hanging="255"/>
+      </w:pPr>
+      <w:r>
+        <w:rPr>
+          <w:b w:val="0"/>
+          <w:sz w:val="20"/>
+        </w:rPr>
+        <w:t xml:space="preserve">1. </w:t>
+      </w:r>
+      <w:r>
+        <w:rPr>
+          <w:b w:val="0"/>
+          <w:sz w:val="20"/>
+        </w:rPr>
+        <w:t xml:space="preserve">Create a new Buy-Fin file (100 Test Oak Lane is fine if you created it </w:t>
+      </w:r>
+      <w:r>
+        <w:rPr>
+          <w:b/>
+          <w:sz w:val="20"/>
+        </w:rPr>
+        <w:t>after</w:t>
+      </w:r>
+      <w:r>
+        <w:rPr>
+          <w:b w:val="0"/>
+          <w:sz w:val="20"/>
+        </w:rPr>
+        <w:t xml:space="preserve"> this round went live). Open Tasks. Find </w:t>
+      </w:r>
+      <w:r>
+        <w:rPr>
+          <w:b/>
+          <w:sz w:val="20"/>
+        </w:rPr>
+        <w:t>Closing Gift</w:t>
+      </w:r>
+      <w:r>
+        <w:rPr>
+          <w:b w:val="0"/>
+          <w:sz w:val="20"/>
+        </w:rPr>
+        <w:t>. Note any ID shown on the row or in Complete this task.</w:t>
+      </w:r>
+    </w:p>
+    <w:p>
+      <w:pPr>
+        <w:spacing w:after="40"/>
+        <w:ind w:left="357" w:hanging="255"/>
+      </w:pPr>
+      <w:r>
+        <w:rPr>
+          <w:b w:val="0"/>
+          <w:sz w:val="20"/>
+        </w:rPr>
+        <w:t xml:space="preserve">2. </w:t>
+      </w:r>
+      <w:r>
+        <w:rPr>
+          <w:b w:val="0"/>
+          <w:sz w:val="20"/>
+        </w:rPr>
+        <w:t xml:space="preserve">Create a new Sell-Fin file. Find </w:t>
+      </w:r>
+      <w:r>
+        <w:rPr>
+          <w:b/>
+          <w:sz w:val="20"/>
+        </w:rPr>
+        <w:t>Closing Gift</w:t>
+      </w:r>
+      <w:r>
+        <w:rPr>
+          <w:b w:val="0"/>
+          <w:sz w:val="20"/>
+        </w:rPr>
+        <w:t xml:space="preserve"> again. Also find </w:t>
+      </w:r>
+      <w:r>
+        <w:rPr>
+          <w:b/>
+          <w:sz w:val="20"/>
+        </w:rPr>
+        <w:t>Schedule Pick Up of Sign and Lockbox</w:t>
+      </w:r>
+      <w:r>
+        <w:rPr>
+          <w:b w:val="0"/>
+          <w:sz w:val="20"/>
+        </w:rPr>
+        <w:t xml:space="preserve"> and </w:t>
+      </w:r>
+      <w:r>
+        <w:rPr>
+          <w:b/>
+          <w:sz w:val="20"/>
+        </w:rPr>
+        <w:t>Change MLS Listing Status to Sold</w:t>
+      </w:r>
+      <w:r>
+        <w:rPr>
+          <w:b w:val="0"/>
+          <w:sz w:val="20"/>
+        </w:rPr>
+        <w:t xml:space="preserve"> if those names are on the listing.</w:t>
+      </w:r>
+    </w:p>
+    <w:p>
+      <w:pPr>
+        <w:spacing w:after="40"/>
+        <w:ind w:left="357" w:hanging="255"/>
+      </w:pPr>
+      <w:r>
+        <w:rPr>
+          <w:b w:val="0"/>
+          <w:sz w:val="20"/>
+        </w:rPr>
+        <w:t xml:space="preserve">3. </w:t>
+      </w:r>
+      <w:r>
+        <w:rPr>
+          <w:b w:val="0"/>
+          <w:sz w:val="20"/>
+        </w:rPr>
+        <w:t xml:space="preserve">Confirm you do </w:t>
+      </w:r>
+      <w:r>
+        <w:rPr>
+          <w:b/>
+          <w:sz w:val="20"/>
+        </w:rPr>
+        <w:t>not</w:t>
+      </w:r>
+      <w:r>
+        <w:rPr>
+          <w:b w:val="0"/>
+          <w:sz w:val="20"/>
+        </w:rPr>
+        <w:t xml:space="preserve"> have extra Closing Gift rows that exist only because the file is Dual or listing-only.</w:t>
+      </w:r>
+    </w:p>
+    <w:p>
+      <w:pPr>
+        <w:spacing w:after="80"/>
+      </w:pPr>
+      <w:r>
+        <w:rPr>
+          <w:b/>
+          <w:sz w:val="20"/>
+        </w:rPr>
+        <w:t>Expected Result</w:t>
+      </w:r>
+    </w:p>
+    <w:p>
+      <w:pPr>
+        <w:spacing w:after="40"/>
+        <w:ind w:left="357" w:hanging="255"/>
+      </w:pPr>
+      <w:r>
+        <w:rPr>
+          <w:b w:val="0"/>
+          <w:sz w:val="20"/>
+        </w:rPr>
+        <w:t xml:space="preserve">- </w:t>
+      </w:r>
+      <w:r>
+        <w:rPr>
+          <w:b w:val="0"/>
+          <w:sz w:val="20"/>
+        </w:rPr>
+        <w:t xml:space="preserve">One </w:t>
+      </w:r>
+      <w:r>
+        <w:rPr>
+          <w:b/>
+          <w:sz w:val="20"/>
+        </w:rPr>
+        <w:t>Closing Gift</w:t>
+      </w:r>
+      <w:r>
+        <w:rPr>
+          <w:b w:val="0"/>
+          <w:sz w:val="20"/>
+        </w:rPr>
+        <w:t xml:space="preserve"> on buyer files and on seller files (live </w:t>
+      </w:r>
+      <w:r>
+        <w:rPr>
+          <w:b/>
+          <w:sz w:val="20"/>
+        </w:rPr>
+        <w:t>370</w:t>
+      </w:r>
+      <w:r>
+        <w:rPr>
+          <w:b w:val="0"/>
+          <w:sz w:val="20"/>
+        </w:rPr>
+        <w:t>). It is an agent reminder, not an Autopilot client email.</w:t>
+      </w:r>
+    </w:p>
+    <w:p>
+      <w:pPr>
+        <w:spacing w:after="40"/>
+        <w:ind w:left="357" w:hanging="255"/>
+      </w:pPr>
+      <w:r>
+        <w:rPr>
+          <w:b w:val="0"/>
+          <w:sz w:val="20"/>
+        </w:rPr>
+        <w:t xml:space="preserve">- </w:t>
+      </w:r>
+      <w:r>
+        <w:rPr>
+          <w:b w:val="0"/>
+          <w:sz w:val="20"/>
+        </w:rPr>
+        <w:t xml:space="preserve">On a listing, lockbox and MLS Sold stay under live </w:t>
+      </w:r>
+      <w:r>
+        <w:rPr>
+          <w:b/>
+          <w:sz w:val="20"/>
+        </w:rPr>
+        <w:t>453</w:t>
+      </w:r>
+      <w:r>
+        <w:rPr>
+          <w:b w:val="0"/>
+          <w:sz w:val="20"/>
+        </w:rPr>
+        <w:t xml:space="preserve"> / </w:t>
+      </w:r>
+      <w:r>
+        <w:rPr>
+          <w:b/>
+          <w:sz w:val="20"/>
+        </w:rPr>
+        <w:t>455</w:t>
+      </w:r>
+      <w:r>
+        <w:rPr>
+          <w:b w:val="0"/>
+          <w:sz w:val="20"/>
+        </w:rPr>
+        <w:t xml:space="preserve"> if an ID is visible. Do not Fail because they are not numbered 470 / 480.</w:t>
+      </w:r>
+    </w:p>
+    <w:p>
+      <w:pPr>
+        <w:spacing w:after="40"/>
+        <w:ind w:left="357" w:hanging="255"/>
+      </w:pPr>
+      <w:r>
+        <w:rPr>
+          <w:b w:val="0"/>
+          <w:sz w:val="20"/>
+        </w:rPr>
+        <w:t xml:space="preserve">- </w:t>
+      </w:r>
+      <w:r>
+        <w:rPr>
+          <w:b w:val="0"/>
+          <w:sz w:val="20"/>
+        </w:rPr>
+        <w:t>Fail: no Closing Gift on a new listing; two Closing Gift rows on a Dual file; the screen renumbered Closing Gift to spreadsheet 360.</w:t>
+      </w:r>
+    </w:p>
+    <w:p>
+      <w:pPr>
+        <w:spacing w:after="80"/>
+      </w:pPr>
+      <w:r>
+        <w:rPr>
+          <w:b/>
+          <w:sz w:val="20"/>
+        </w:rPr>
+        <w:t>Feedback</w:t>
+      </w:r>
+    </w:p>
+    <w:p>
+      <w:pPr>
+        <w:spacing w:after="80"/>
+      </w:pPr>
+      <w:r>
+        <w:rPr>
+          <w:b w:val="0"/>
+          <w:sz w:val="20"/>
+        </w:rPr>
+        <w:t>_Please note: Status (Pass / Fail / Needs Work), and any comments or issues you hit._</w:t>
+      </w:r>
+    </w:p>
+    <w:p>
+      <w:pPr>
+        <w:spacing w:after="80"/>
+      </w:pPr>
+      <w:r>
+        <w:rPr>
+          <w:b w:val="0"/>
+          <w:sz w:val="20"/>
+        </w:rPr>
+        <w:t>&gt; _Status:_ &gt; &gt; _Comments:_</w:t>
+      </w:r>
+    </w:p>
+    <w:p>
+      <w:pPr>
+        <w:spacing w:after="120"/>
+      </w:pPr>
+    </w:p>
+    <w:p>
+      <w:pPr>
+        <w:pStyle w:val="Heading2"/>
+        <w:spacing w:after="80" w:before="240"/>
+      </w:pPr>
+      <w:r>
+        <w:t>28. Dual agency (Both)</w:t>
+      </w:r>
+    </w:p>
+    <w:p>
+      <w:pPr>
+        <w:spacing w:after="80"/>
+      </w:pPr>
+      <w:r>
+        <w:rPr>
+          <w:b/>
+          <w:sz w:val="20"/>
+        </w:rPr>
+        <w:t>Route / Location</w:t>
+      </w:r>
+    </w:p>
+    <w:p>
+      <w:pPr>
+        <w:spacing w:after="80"/>
+      </w:pPr>
+      <w:r>
+        <w:rPr>
+          <w:b w:val="0"/>
+          <w:sz w:val="20"/>
+        </w:rPr>
+        <w:t xml:space="preserve">Create </w:t>
+      </w:r>
+      <w:r>
+        <w:rPr>
+          <w:b/>
+          <w:sz w:val="20"/>
+        </w:rPr>
+        <w:t>700 Test Dual Ave</w:t>
+      </w:r>
+      <w:r>
+        <w:rPr>
+          <w:b w:val="0"/>
+          <w:sz w:val="20"/>
+        </w:rPr>
+        <w:t xml:space="preserve">. Represent </w:t>
+      </w:r>
+      <w:r>
+        <w:rPr>
+          <w:b/>
+          <w:sz w:val="20"/>
+        </w:rPr>
+        <w:t>Buyer and Seller</w:t>
+      </w:r>
+      <w:r>
+        <w:rPr>
+          <w:b w:val="0"/>
+          <w:sz w:val="20"/>
+        </w:rPr>
+        <w:t>. Financed. Contract uploaded. Contacts you control. Pin Assisted.</w:t>
+      </w:r>
+    </w:p>
+    <w:p>
+      <w:pPr>
+        <w:spacing w:after="80"/>
+      </w:pPr>
+      <w:r>
+        <w:rPr>
+          <w:b/>
+          <w:sz w:val="20"/>
+        </w:rPr>
+        <w:t>How To Test</w:t>
+      </w:r>
+    </w:p>
+    <w:p>
+      <w:pPr>
+        <w:spacing w:after="40"/>
+        <w:ind w:left="357" w:hanging="255"/>
+      </w:pPr>
+      <w:r>
+        <w:rPr>
+          <w:b w:val="0"/>
+          <w:sz w:val="20"/>
+        </w:rPr>
+        <w:t xml:space="preserve">1. </w:t>
+      </w:r>
+      <w:r>
+        <w:rPr>
+          <w:b w:val="0"/>
+          <w:sz w:val="20"/>
+        </w:rPr>
+        <w:t xml:space="preserve">Finish the wizard. Open </w:t>
+      </w:r>
+      <w:r>
+        <w:rPr>
+          <w:b/>
+          <w:sz w:val="20"/>
+        </w:rPr>
+        <w:t>Tasks</w:t>
+      </w:r>
+      <w:r>
+        <w:rPr>
+          <w:b w:val="0"/>
+          <w:sz w:val="20"/>
+        </w:rPr>
+        <w:t>.</w:t>
+      </w:r>
+    </w:p>
+    <w:p>
+      <w:pPr>
+        <w:spacing w:after="40"/>
+        <w:ind w:left="357" w:hanging="255"/>
+      </w:pPr>
+      <w:r>
+        <w:rPr>
+          <w:b w:val="0"/>
+          <w:sz w:val="20"/>
+        </w:rPr>
+        <w:t xml:space="preserve">2. </w:t>
+      </w:r>
+      <w:r>
+        <w:rPr>
+          <w:b w:val="0"/>
+          <w:sz w:val="20"/>
+        </w:rPr>
+        <w:t xml:space="preserve">Confirm </w:t>
+      </w:r>
+      <w:r>
+        <w:rPr>
+          <w:b/>
+          <w:sz w:val="20"/>
+        </w:rPr>
+        <w:t>Buyer Welcome</w:t>
+      </w:r>
+      <w:r>
+        <w:rPr>
+          <w:b w:val="0"/>
+          <w:sz w:val="20"/>
+        </w:rPr>
+        <w:t xml:space="preserve"> and </w:t>
+      </w:r>
+      <w:r>
+        <w:rPr>
+          <w:b/>
+          <w:sz w:val="20"/>
+        </w:rPr>
+        <w:t>Seller Welcome</w:t>
+      </w:r>
+      <w:r>
+        <w:rPr>
+          <w:b w:val="0"/>
+          <w:sz w:val="20"/>
+        </w:rPr>
+        <w:t xml:space="preserve"> both exist. Confirm </w:t>
+      </w:r>
+      <w:r>
+        <w:rPr>
+          <w:b/>
+          <w:sz w:val="20"/>
+        </w:rPr>
+        <w:t>Co-op Agent Welcome</w:t>
+      </w:r>
+      <w:r>
+        <w:rPr>
+          <w:b w:val="0"/>
+          <w:sz w:val="20"/>
+        </w:rPr>
+        <w:t xml:space="preserve"> does </w:t>
+      </w:r>
+      <w:r>
+        <w:rPr>
+          <w:b/>
+          <w:sz w:val="20"/>
+        </w:rPr>
+        <w:t>not</w:t>
+      </w:r>
+      <w:r>
+        <w:rPr>
+          <w:b w:val="0"/>
+          <w:sz w:val="20"/>
+        </w:rPr>
+        <w:t>.</w:t>
+      </w:r>
+    </w:p>
+    <w:p>
+      <w:pPr>
+        <w:spacing w:after="40"/>
+        <w:ind w:left="357" w:hanging="255"/>
+      </w:pPr>
+      <w:r>
+        <w:rPr>
+          <w:b w:val="0"/>
+          <w:sz w:val="20"/>
+        </w:rPr>
+        <w:t xml:space="preserve">3. </w:t>
+      </w:r>
+      <w:r>
+        <w:rPr>
+          <w:b w:val="0"/>
+          <w:sz w:val="20"/>
+        </w:rPr>
+        <w:t xml:space="preserve">Confirm </w:t>
+      </w:r>
+      <w:r>
+        <w:rPr>
+          <w:b/>
+          <w:sz w:val="20"/>
+        </w:rPr>
+        <w:t>one</w:t>
+      </w:r>
+      <w:r>
+        <w:rPr>
+          <w:b w:val="0"/>
+          <w:sz w:val="20"/>
+        </w:rPr>
+        <w:t xml:space="preserve"> Order Title </w:t>
+      </w:r>
+      <w:r>
+        <w:rPr>
+          <w:b/>
+          <w:sz w:val="20"/>
+        </w:rPr>
+        <w:t>or</w:t>
+      </w:r>
+      <w:r>
+        <w:rPr>
+          <w:b w:val="0"/>
+          <w:sz w:val="20"/>
+        </w:rPr>
+        <w:t xml:space="preserve"> one Confirm Title Order (not both), and </w:t>
+      </w:r>
+      <w:r>
+        <w:rPr>
+          <w:b/>
+          <w:sz w:val="20"/>
+        </w:rPr>
+        <w:t>one</w:t>
+      </w:r>
+      <w:r>
+        <w:rPr>
+          <w:b w:val="0"/>
+          <w:sz w:val="20"/>
+        </w:rPr>
+        <w:t xml:space="preserve"> Loan Officer Welcome.</w:t>
+      </w:r>
+    </w:p>
+    <w:p>
+      <w:pPr>
+        <w:spacing w:after="40"/>
+        <w:ind w:left="357" w:hanging="255"/>
+      </w:pPr>
+      <w:r>
+        <w:rPr>
+          <w:b w:val="0"/>
+          <w:sz w:val="20"/>
+        </w:rPr>
+        <w:t xml:space="preserve">4. </w:t>
+      </w:r>
+      <w:r>
+        <w:rPr>
+          <w:b w:val="0"/>
+          <w:sz w:val="20"/>
+        </w:rPr>
+        <w:t xml:space="preserve">Confirm </w:t>
+      </w:r>
+      <w:r>
+        <w:rPr>
+          <w:b/>
+          <w:sz w:val="20"/>
+        </w:rPr>
+        <w:t>both</w:t>
+      </w:r>
+      <w:r>
+        <w:rPr>
+          <w:b w:val="0"/>
+          <w:sz w:val="20"/>
+        </w:rPr>
+        <w:t xml:space="preserve"> Inspection Scheduled (buyer and seller), </w:t>
+      </w:r>
+      <w:r>
+        <w:rPr>
+          <w:b/>
+          <w:sz w:val="20"/>
+        </w:rPr>
+        <w:t>both</w:t>
+      </w:r>
+      <w:r>
+        <w:rPr>
+          <w:b w:val="0"/>
+          <w:sz w:val="20"/>
+        </w:rPr>
+        <w:t xml:space="preserve"> Inspection Response Reminder, and </w:t>
+      </w:r>
+      <w:r>
+        <w:rPr>
+          <w:b/>
+          <w:sz w:val="20"/>
+        </w:rPr>
+        <w:t>both</w:t>
+      </w:r>
+      <w:r>
+        <w:rPr>
+          <w:b w:val="0"/>
+          <w:sz w:val="20"/>
+        </w:rPr>
+        <w:t xml:space="preserve"> Inspection Negotiated.</w:t>
+      </w:r>
+    </w:p>
+    <w:p>
+      <w:pPr>
+        <w:spacing w:after="40"/>
+        <w:ind w:left="357" w:hanging="255"/>
+      </w:pPr>
+      <w:r>
+        <w:rPr>
+          <w:b w:val="0"/>
+          <w:sz w:val="20"/>
+        </w:rPr>
+        <w:t xml:space="preserve">5. </w:t>
+      </w:r>
+      <w:r>
+        <w:rPr>
+          <w:b w:val="0"/>
+          <w:sz w:val="20"/>
+        </w:rPr>
+        <w:t xml:space="preserve">If you answered HOA = Yes in the wizard: Request HOA from the </w:t>
+      </w:r>
+      <w:r>
+        <w:rPr>
+          <w:b/>
+          <w:sz w:val="20"/>
+        </w:rPr>
+        <w:t>seller</w:t>
+      </w:r>
+      <w:r>
+        <w:rPr>
+          <w:b w:val="0"/>
+          <w:sz w:val="20"/>
+        </w:rPr>
+        <w:t xml:space="preserve">, Deliver HOA to the </w:t>
+      </w:r>
+      <w:r>
+        <w:rPr>
+          <w:b/>
+          <w:sz w:val="20"/>
+        </w:rPr>
+        <w:t>buyer</w:t>
+      </w:r>
+      <w:r>
+        <w:rPr>
+          <w:b w:val="0"/>
+          <w:sz w:val="20"/>
+        </w:rPr>
+        <w:t>. No request/deliver HOA to a co-op.</w:t>
+      </w:r>
+    </w:p>
+    <w:p>
+      <w:pPr>
+        <w:spacing w:after="40"/>
+        <w:ind w:left="357" w:hanging="255"/>
+      </w:pPr>
+      <w:r>
+        <w:rPr>
+          <w:b w:val="0"/>
+          <w:sz w:val="20"/>
+        </w:rPr>
+        <w:t xml:space="preserve">6. </w:t>
+      </w:r>
+      <w:r>
+        <w:rPr>
+          <w:b w:val="0"/>
+          <w:sz w:val="20"/>
+        </w:rPr>
+        <w:t>Open Co-op-target letters only to confirm they are absent (Deliver Utility Info to the buyer’s agent, Confirm Home Warranty, Buyer’s Agent Closing Information).</w:t>
+      </w:r>
+    </w:p>
+    <w:p>
+      <w:pPr>
+        <w:spacing w:after="80"/>
+      </w:pPr>
+      <w:r>
+        <w:rPr>
+          <w:b/>
+          <w:sz w:val="20"/>
+        </w:rPr>
+        <w:t>Expected Result</w:t>
+      </w:r>
+    </w:p>
+    <w:p>
+      <w:pPr>
+        <w:spacing w:after="40"/>
+        <w:ind w:left="357" w:hanging="255"/>
+      </w:pPr>
+      <w:r>
+        <w:rPr>
+          <w:b w:val="0"/>
+          <w:sz w:val="20"/>
+        </w:rPr>
+        <w:t xml:space="preserve">- </w:t>
+      </w:r>
+      <w:r>
+        <w:rPr>
+          <w:b w:val="0"/>
+          <w:sz w:val="20"/>
+        </w:rPr>
+        <w:t>Title and Loan Officer once. Buyer and seller party work both populate. No co-op letters (a Both file has no co-op).</w:t>
+      </w:r>
+    </w:p>
+    <w:p>
+      <w:pPr>
+        <w:spacing w:after="40"/>
+        <w:ind w:left="357" w:hanging="255"/>
+      </w:pPr>
+      <w:r>
+        <w:rPr>
+          <w:b w:val="0"/>
+          <w:sz w:val="20"/>
+        </w:rPr>
+        <w:t xml:space="preserve">- </w:t>
+      </w:r>
+      <w:r>
+        <w:rPr>
+          <w:b w:val="0"/>
+          <w:sz w:val="20"/>
+        </w:rPr>
+        <w:t>Fail: Co-op Agent Welcome on Dual; only the buyer inspection reminder; extra Dual-only copies of Deliver Title, Closing Gift, or Internal Thank You that exist only because the file is Both.</w:t>
+      </w:r>
+    </w:p>
+    <w:p>
+      <w:pPr>
+        <w:spacing w:after="80"/>
+      </w:pPr>
+      <w:r>
+        <w:rPr>
+          <w:b/>
+          <w:sz w:val="20"/>
+        </w:rPr>
+        <w:t>Feedback</w:t>
+      </w:r>
+    </w:p>
+    <w:p>
+      <w:pPr>
+        <w:spacing w:after="80"/>
+      </w:pPr>
+      <w:r>
+        <w:rPr>
+          <w:b w:val="0"/>
+          <w:sz w:val="20"/>
+        </w:rPr>
+        <w:t>_Please note: Status (Pass / Fail / Needs Work), and any comments or issues you hit._</w:t>
+      </w:r>
+    </w:p>
+    <w:p>
+      <w:pPr>
+        <w:spacing w:after="80"/>
+      </w:pPr>
+      <w:r>
+        <w:rPr>
+          <w:b w:val="0"/>
+          <w:sz w:val="20"/>
+        </w:rPr>
+        <w:t>&gt; _Status:_ &gt; &gt; _Comments:_</w:t>
+      </w:r>
+    </w:p>
+    <w:p>
+      <w:pPr>
+        <w:spacing w:after="120"/>
+      </w:pPr>
+    </w:p>
+    <w:p>
+      <w:pPr>
+        <w:pStyle w:val="Heading2"/>
+        <w:spacing w:after="80" w:before="240"/>
+      </w:pPr>
+      <w:r>
+        <w:t>29. Order Title vs Confirm Title Order</w:t>
+      </w:r>
+    </w:p>
+    <w:p>
+      <w:pPr>
+        <w:spacing w:after="80"/>
+      </w:pPr>
+      <w:r>
+        <w:rPr>
+          <w:b/>
+          <w:sz w:val="20"/>
+        </w:rPr>
+        <w:t>Route / Location</w:t>
+      </w:r>
+    </w:p>
+    <w:p>
+      <w:pPr>
+        <w:spacing w:after="80"/>
+      </w:pPr>
+      <w:r>
+        <w:rPr>
+          <w:b w:val="0"/>
+          <w:sz w:val="20"/>
+        </w:rPr>
+        <w:t xml:space="preserve">Two </w:t>
+      </w:r>
+      <w:r>
+        <w:rPr>
+          <w:b/>
+          <w:sz w:val="20"/>
+        </w:rPr>
+        <w:t>new</w:t>
+      </w:r>
+      <w:r>
+        <w:rPr>
+          <w:b w:val="0"/>
+          <w:sz w:val="20"/>
+        </w:rPr>
+        <w:t xml:space="preserve"> Buyer financed files → Contract Details (who orders title) → Tasks → kebab → </w:t>
+      </w:r>
+      <w:r>
+        <w:rPr>
+          <w:b/>
+          <w:sz w:val="20"/>
+        </w:rPr>
+        <w:t>Email transaction party</w:t>
+      </w:r>
+      <w:r>
+        <w:rPr>
+          <w:b w:val="0"/>
+          <w:sz w:val="20"/>
+        </w:rPr>
+        <w:t xml:space="preserve"> Do not Send unless To is an inbox you own.</w:t>
+      </w:r>
+    </w:p>
+    <w:p>
+      <w:pPr>
+        <w:spacing w:after="80"/>
+      </w:pPr>
+      <w:r>
+        <w:rPr>
+          <w:b/>
+          <w:sz w:val="20"/>
+        </w:rPr>
+        <w:t>How To Test</w:t>
+      </w:r>
+    </w:p>
+    <w:p>
+      <w:pPr>
+        <w:spacing w:after="40"/>
+        <w:ind w:left="357" w:hanging="255"/>
+      </w:pPr>
+      <w:r>
+        <w:rPr>
+          <w:b w:val="0"/>
+          <w:sz w:val="20"/>
+        </w:rPr>
+        <w:t xml:space="preserve">1. </w:t>
+      </w:r>
+      <w:r>
+        <w:rPr>
+          <w:b w:val="0"/>
+          <w:sz w:val="20"/>
+        </w:rPr>
+        <w:t xml:space="preserve">File A: wizard says </w:t>
+      </w:r>
+      <w:r>
+        <w:rPr>
+          <w:b/>
+          <w:sz w:val="20"/>
+        </w:rPr>
+        <w:t>your side</w:t>
+      </w:r>
+      <w:r>
+        <w:rPr>
+          <w:b w:val="0"/>
+          <w:sz w:val="20"/>
+        </w:rPr>
+        <w:t xml:space="preserve"> orders title. Tasks should show </w:t>
+      </w:r>
+      <w:r>
+        <w:rPr>
+          <w:b/>
+          <w:sz w:val="20"/>
+        </w:rPr>
+        <w:t>Order Title</w:t>
+      </w:r>
+      <w:r>
+        <w:rPr>
+          <w:b w:val="0"/>
+          <w:sz w:val="20"/>
+        </w:rPr>
+        <w:t>, not Confirm Title Order.</w:t>
+      </w:r>
+    </w:p>
+    <w:p>
+      <w:pPr>
+        <w:spacing w:after="40"/>
+        <w:ind w:left="357" w:hanging="255"/>
+      </w:pPr>
+      <w:r>
+        <w:rPr>
+          <w:b w:val="0"/>
+          <w:sz w:val="20"/>
+        </w:rPr>
+        <w:t xml:space="preserve">2. </w:t>
+      </w:r>
+      <w:r>
+        <w:rPr>
+          <w:b w:val="0"/>
+          <w:sz w:val="20"/>
+        </w:rPr>
+        <w:t xml:space="preserve">File B: wizard says the </w:t>
+      </w:r>
+      <w:r>
+        <w:rPr>
+          <w:b/>
+          <w:sz w:val="20"/>
+        </w:rPr>
+        <w:t>other side / co-op</w:t>
+      </w:r>
+      <w:r>
+        <w:rPr>
+          <w:b w:val="0"/>
+          <w:sz w:val="20"/>
+        </w:rPr>
+        <w:t xml:space="preserve"> orders title. Tasks should show </w:t>
+      </w:r>
+      <w:r>
+        <w:rPr>
+          <w:b/>
+          <w:sz w:val="20"/>
+        </w:rPr>
+        <w:t>Confirm Title Order</w:t>
+      </w:r>
+      <w:r>
+        <w:rPr>
+          <w:b w:val="0"/>
+          <w:sz w:val="20"/>
+        </w:rPr>
+        <w:t>, not Order Title.</w:t>
+      </w:r>
+    </w:p>
+    <w:p>
+      <w:pPr>
+        <w:spacing w:after="40"/>
+        <w:ind w:left="357" w:hanging="255"/>
+      </w:pPr>
+      <w:r>
+        <w:rPr>
+          <w:b w:val="0"/>
+          <w:sz w:val="20"/>
+        </w:rPr>
+        <w:t xml:space="preserve">3. </w:t>
+      </w:r>
+      <w:r>
+        <w:rPr>
+          <w:b w:val="0"/>
+          <w:sz w:val="20"/>
+        </w:rPr>
+        <w:t xml:space="preserve">On each, Email transaction party. Read the body. On Confirm Title Order, look for courtesy-order language (example: as a courtesy to the co-op agent, engage the escrow agent). It must </w:t>
+      </w:r>
+      <w:r>
+        <w:rPr>
+          <w:b/>
+          <w:sz w:val="20"/>
+        </w:rPr>
+        <w:t>not</w:t>
+      </w:r>
+      <w:r>
+        <w:rPr>
+          <w:b w:val="0"/>
+          <w:sz w:val="20"/>
+        </w:rPr>
+        <w:t xml:space="preserve"> read as “has title been ordered?”</w:t>
+      </w:r>
+    </w:p>
+    <w:p>
+      <w:pPr>
+        <w:spacing w:after="40"/>
+        <w:ind w:left="357" w:hanging="255"/>
+      </w:pPr>
+      <w:r>
+        <w:rPr>
+          <w:b w:val="0"/>
+          <w:sz w:val="20"/>
+        </w:rPr>
+        <w:t xml:space="preserve">4. </w:t>
+      </w:r>
+      <w:r>
+        <w:rPr>
+          <w:b w:val="0"/>
+          <w:sz w:val="20"/>
+        </w:rPr>
+        <w:t xml:space="preserve">If Documents has a personal-property or monetary addendum / amendment, confirm it is </w:t>
+      </w:r>
+      <w:r>
+        <w:rPr>
+          <w:b/>
+          <w:sz w:val="20"/>
+        </w:rPr>
+        <w:t>not</w:t>
+      </w:r>
+      <w:r>
+        <w:rPr>
+          <w:b w:val="0"/>
+          <w:sz w:val="20"/>
+        </w:rPr>
+        <w:t xml:space="preserve"> listed under the plan. The executed agreement package may still be there.</w:t>
+      </w:r>
+    </w:p>
+    <w:p>
+      <w:pPr>
+        <w:spacing w:after="80"/>
+      </w:pPr>
+      <w:r>
+        <w:rPr>
+          <w:b/>
+          <w:sz w:val="20"/>
+        </w:rPr>
+        <w:t>Expected Result</w:t>
+      </w:r>
+    </w:p>
+    <w:p>
+      <w:pPr>
+        <w:spacing w:after="40"/>
+        <w:ind w:left="357" w:hanging="255"/>
+      </w:pPr>
+      <w:r>
+        <w:rPr>
+          <w:b w:val="0"/>
+          <w:sz w:val="20"/>
+        </w:rPr>
+        <w:t xml:space="preserve">- </w:t>
+      </w:r>
+      <w:r>
+        <w:rPr>
+          <w:b w:val="0"/>
+          <w:sz w:val="20"/>
+        </w:rPr>
+        <w:t>Same document package on both letters. Difference is the script and which wizard answer created the row.</w:t>
+      </w:r>
+    </w:p>
+    <w:p>
+      <w:pPr>
+        <w:spacing w:after="40"/>
+        <w:ind w:left="357" w:hanging="255"/>
+      </w:pPr>
+      <w:r>
+        <w:rPr>
+          <w:b w:val="0"/>
+          <w:sz w:val="20"/>
+        </w:rPr>
+        <w:t xml:space="preserve">- </w:t>
+      </w:r>
+      <w:r>
+        <w:rPr>
+          <w:b w:val="0"/>
+          <w:sz w:val="20"/>
+        </w:rPr>
+        <w:t>Fail: both 70 and 80 on one file; Confirm Title Order is still a follow-up “was it ordered?”; addenda listed on the plan.</w:t>
+      </w:r>
+    </w:p>
+    <w:p>
+      <w:pPr>
+        <w:spacing w:after="80"/>
+      </w:pPr>
+      <w:r>
+        <w:rPr>
+          <w:b/>
+          <w:sz w:val="20"/>
+        </w:rPr>
+        <w:t>Feedback</w:t>
+      </w:r>
+    </w:p>
+    <w:p>
+      <w:pPr>
+        <w:spacing w:after="80"/>
+      </w:pPr>
+      <w:r>
+        <w:rPr>
+          <w:b w:val="0"/>
+          <w:sz w:val="20"/>
+        </w:rPr>
+        <w:t>_Please note: Status (Pass / Fail / Needs Work), and any comments or issues you hit._</w:t>
+      </w:r>
+    </w:p>
+    <w:p>
+      <w:pPr>
+        <w:spacing w:after="80"/>
+      </w:pPr>
+      <w:r>
+        <w:rPr>
+          <w:b w:val="0"/>
+          <w:sz w:val="20"/>
+        </w:rPr>
+        <w:t>&gt; _Status:_ &gt; &gt; _Comments:_</w:t>
+      </w:r>
+    </w:p>
+    <w:p>
+      <w:pPr>
+        <w:spacing w:after="120"/>
+      </w:pPr>
+    </w:p>
+    <w:p>
+      <w:pPr>
+        <w:pStyle w:val="Heading2"/>
+        <w:spacing w:after="80" w:before="240"/>
+      </w:pPr>
+      <w:r>
+        <w:t>30. Deliver Utility Info on a listing (160)</w:t>
+      </w:r>
+    </w:p>
+    <w:p>
+      <w:pPr>
+        <w:spacing w:after="80"/>
+      </w:pPr>
+      <w:r>
+        <w:rPr>
+          <w:b/>
+          <w:sz w:val="20"/>
+        </w:rPr>
+        <w:t>Route / Location</w:t>
+      </w:r>
+    </w:p>
+    <w:p>
+      <w:pPr>
+        <w:spacing w:after="80"/>
+      </w:pPr>
+      <w:r>
+        <w:rPr>
+          <w:b w:val="0"/>
+          <w:sz w:val="20"/>
+        </w:rPr>
+        <w:t xml:space="preserve">Create </w:t>
+      </w:r>
+      <w:r>
+        <w:rPr>
+          <w:b/>
+          <w:sz w:val="20"/>
+        </w:rPr>
+        <w:t>800 Test Utility Ln</w:t>
+      </w:r>
+      <w:r>
+        <w:rPr>
+          <w:b w:val="0"/>
+          <w:sz w:val="20"/>
+        </w:rPr>
+        <w:t xml:space="preserve">. Represent </w:t>
+      </w:r>
+      <w:r>
+        <w:rPr>
+          <w:b/>
+          <w:sz w:val="20"/>
+        </w:rPr>
+        <w:t>Seller</w:t>
+      </w:r>
+      <w:r>
+        <w:rPr>
+          <w:b w:val="0"/>
+          <w:sz w:val="20"/>
+        </w:rPr>
+        <w:t xml:space="preserve">. Financed. Upload a utility-information document on </w:t>
+      </w:r>
+      <w:r>
+        <w:rPr>
+          <w:b/>
+          <w:sz w:val="20"/>
+        </w:rPr>
+        <w:t>Documents</w:t>
+      </w:r>
+      <w:r>
+        <w:rPr>
+          <w:b w:val="0"/>
+          <w:sz w:val="20"/>
+        </w:rPr>
+        <w:t>. Pin Assisted.</w:t>
+      </w:r>
+    </w:p>
+    <w:p>
+      <w:pPr>
+        <w:spacing w:after="80"/>
+      </w:pPr>
+      <w:r>
+        <w:rPr>
+          <w:b/>
+          <w:sz w:val="20"/>
+        </w:rPr>
+        <w:t>How To Test</w:t>
+      </w:r>
+    </w:p>
+    <w:p>
+      <w:pPr>
+        <w:spacing w:after="40"/>
+        <w:ind w:left="357" w:hanging="255"/>
+      </w:pPr>
+      <w:r>
+        <w:rPr>
+          <w:b w:val="0"/>
+          <w:sz w:val="20"/>
+        </w:rPr>
+        <w:t xml:space="preserve">1. </w:t>
+      </w:r>
+      <w:r>
+        <w:rPr>
+          <w:b w:val="0"/>
+          <w:sz w:val="20"/>
+        </w:rPr>
+        <w:t xml:space="preserve">Open Tasks. Find </w:t>
+      </w:r>
+      <w:r>
+        <w:rPr>
+          <w:b/>
+          <w:sz w:val="20"/>
+        </w:rPr>
+        <w:t>Deliver Utility Info</w:t>
+      </w:r>
+      <w:r>
+        <w:rPr>
+          <w:b w:val="0"/>
+          <w:sz w:val="20"/>
+        </w:rPr>
+        <w:t>.</w:t>
+      </w:r>
+    </w:p>
+    <w:p>
+      <w:pPr>
+        <w:spacing w:after="40"/>
+        <w:ind w:left="357" w:hanging="255"/>
+      </w:pPr>
+      <w:r>
+        <w:rPr>
+          <w:b w:val="0"/>
+          <w:sz w:val="20"/>
+        </w:rPr>
+        <w:t xml:space="preserve">2. </w:t>
+      </w:r>
+      <w:r>
+        <w:rPr>
+          <w:b w:val="0"/>
+          <w:sz w:val="20"/>
+        </w:rPr>
+        <w:t xml:space="preserve">Kebab → Email transaction party. Note </w:t>
+      </w:r>
+      <w:r>
+        <w:rPr>
+          <w:b/>
+          <w:sz w:val="20"/>
+        </w:rPr>
+        <w:t>To:</w:t>
+      </w:r>
+      <w:r>
+        <w:rPr>
+          <w:b w:val="0"/>
+          <w:sz w:val="20"/>
+        </w:rPr>
+        <w:t>.</w:t>
+      </w:r>
+    </w:p>
+    <w:p>
+      <w:pPr>
+        <w:spacing w:after="40"/>
+        <w:ind w:left="357" w:hanging="255"/>
+      </w:pPr>
+      <w:r>
+        <w:rPr>
+          <w:b w:val="0"/>
+          <w:sz w:val="20"/>
+        </w:rPr>
+        <w:t xml:space="preserve">3. </w:t>
+      </w:r>
+      <w:r>
+        <w:rPr>
+          <w:b w:val="0"/>
+          <w:sz w:val="20"/>
+        </w:rPr>
+        <w:t>Close without sending if To is not yours.</w:t>
+      </w:r>
+    </w:p>
+    <w:p>
+      <w:pPr>
+        <w:spacing w:after="80"/>
+      </w:pPr>
+      <w:r>
+        <w:rPr>
+          <w:b/>
+          <w:sz w:val="20"/>
+        </w:rPr>
+        <w:t>Expected Result</w:t>
+      </w:r>
+    </w:p>
+    <w:p>
+      <w:pPr>
+        <w:spacing w:after="40"/>
+        <w:ind w:left="357" w:hanging="255"/>
+      </w:pPr>
+      <w:r>
+        <w:rPr>
+          <w:b w:val="0"/>
+          <w:sz w:val="20"/>
+        </w:rPr>
+        <w:t xml:space="preserve">- </w:t>
+      </w:r>
+      <w:r>
+        <w:rPr>
+          <w:b/>
+          <w:sz w:val="20"/>
+        </w:rPr>
+        <w:t>To:</w:t>
+      </w:r>
+      <w:r>
+        <w:rPr>
+          <w:b w:val="0"/>
+          <w:sz w:val="20"/>
+        </w:rPr>
+        <w:t xml:space="preserve"> the co-op / buyer’s agent, not your seller.</w:t>
+      </w:r>
+    </w:p>
+    <w:p>
+      <w:pPr>
+        <w:spacing w:after="40"/>
+        <w:ind w:left="357" w:hanging="255"/>
+      </w:pPr>
+      <w:r>
+        <w:rPr>
+          <w:b w:val="0"/>
+          <w:sz w:val="20"/>
+        </w:rPr>
+        <w:t xml:space="preserve">- </w:t>
+      </w:r>
+      <w:r>
+        <w:rPr>
+          <w:b w:val="0"/>
+          <w:sz w:val="20"/>
+        </w:rPr>
+        <w:t>Fail: To is the seller; To is the buyer client; the letter is missing on a new listing that has utility info.</w:t>
+      </w:r>
+    </w:p>
+    <w:p>
+      <w:pPr>
+        <w:spacing w:after="80"/>
+      </w:pPr>
+      <w:r>
+        <w:rPr>
+          <w:b/>
+          <w:sz w:val="20"/>
+        </w:rPr>
+        <w:t>Feedback</w:t>
+      </w:r>
+    </w:p>
+    <w:p>
+      <w:pPr>
+        <w:spacing w:after="80"/>
+      </w:pPr>
+      <w:r>
+        <w:rPr>
+          <w:b w:val="0"/>
+          <w:sz w:val="20"/>
+        </w:rPr>
+        <w:t>_Please note: Status (Pass / Fail / Needs Work), and any comments or issues you hit._</w:t>
+      </w:r>
+    </w:p>
+    <w:p>
+      <w:pPr>
+        <w:spacing w:after="80"/>
+      </w:pPr>
+      <w:r>
+        <w:rPr>
+          <w:b w:val="0"/>
+          <w:sz w:val="20"/>
+        </w:rPr>
+        <w:t>&gt; _Status:_ &gt; &gt; _Comments:_</w:t>
+      </w:r>
+    </w:p>
+    <w:p>
+      <w:pPr>
+        <w:spacing w:after="120"/>
+      </w:pPr>
+    </w:p>
+    <w:p>
+      <w:pPr>
+        <w:pStyle w:val="Heading2"/>
+        <w:spacing w:after="80" w:before="240"/>
+      </w:pPr>
+      <w:r>
+        <w:t>31. Order Home Warranty is an internal reminder</w:t>
+      </w:r>
+    </w:p>
+    <w:p>
+      <w:pPr>
+        <w:spacing w:after="80"/>
+      </w:pPr>
+      <w:r>
+        <w:rPr>
+          <w:b/>
+          <w:sz w:val="20"/>
+        </w:rPr>
+        <w:t>Route / Location</w:t>
+      </w:r>
+    </w:p>
+    <w:p>
+      <w:pPr>
+        <w:spacing w:after="80"/>
+      </w:pPr>
+      <w:r>
+        <w:rPr>
+          <w:b w:val="0"/>
+          <w:sz w:val="20"/>
+        </w:rPr>
+        <w:t xml:space="preserve">New file where the wizard says </w:t>
+      </w:r>
+      <w:r>
+        <w:rPr>
+          <w:b/>
+          <w:sz w:val="20"/>
+        </w:rPr>
+        <w:t>your side</w:t>
+      </w:r>
+      <w:r>
+        <w:rPr>
+          <w:b w:val="0"/>
+          <w:sz w:val="20"/>
+        </w:rPr>
+        <w:t xml:space="preserve"> orders the home warranty → Tasks → </w:t>
+      </w:r>
+      <w:r>
+        <w:rPr>
+          <w:b/>
+          <w:sz w:val="20"/>
+        </w:rPr>
+        <w:t>Order Home Warranty</w:t>
+      </w:r>
+      <w:r>
+        <w:rPr>
+          <w:b w:val="0"/>
+          <w:sz w:val="20"/>
+        </w:rPr>
+        <w:t xml:space="preserve"> → Email transaction party</w:t>
+      </w:r>
+    </w:p>
+    <w:p>
+      <w:pPr>
+        <w:spacing w:after="80"/>
+      </w:pPr>
+      <w:r>
+        <w:rPr>
+          <w:b/>
+          <w:sz w:val="20"/>
+        </w:rPr>
+        <w:t>How To Test</w:t>
+      </w:r>
+    </w:p>
+    <w:p>
+      <w:pPr>
+        <w:spacing w:after="40"/>
+        <w:ind w:left="357" w:hanging="255"/>
+      </w:pPr>
+      <w:r>
+        <w:rPr>
+          <w:b w:val="0"/>
+          <w:sz w:val="20"/>
+        </w:rPr>
+        <w:t xml:space="preserve">1. </w:t>
+      </w:r>
+      <w:r>
+        <w:rPr>
+          <w:b w:val="0"/>
+          <w:sz w:val="20"/>
+        </w:rPr>
+        <w:t>Create a financed file with home warranty = yes, ordered by us.</w:t>
+      </w:r>
+    </w:p>
+    <w:p>
+      <w:pPr>
+        <w:spacing w:after="40"/>
+        <w:ind w:left="357" w:hanging="255"/>
+      </w:pPr>
+      <w:r>
+        <w:rPr>
+          <w:b w:val="0"/>
+          <w:sz w:val="20"/>
+        </w:rPr>
+        <w:t xml:space="preserve">2. </w:t>
+      </w:r>
+      <w:r>
+        <w:rPr>
+          <w:b w:val="0"/>
+          <w:sz w:val="20"/>
+        </w:rPr>
+        <w:t>Open Order Home Warranty. Read To, Cc, and the body.</w:t>
+      </w:r>
+    </w:p>
+    <w:p>
+      <w:pPr>
+        <w:spacing w:after="40"/>
+        <w:ind w:left="357" w:hanging="255"/>
+      </w:pPr>
+      <w:r>
+        <w:rPr>
+          <w:b w:val="0"/>
+          <w:sz w:val="20"/>
+        </w:rPr>
+        <w:t xml:space="preserve">3. </w:t>
+      </w:r>
+      <w:r>
+        <w:rPr>
+          <w:b w:val="0"/>
+          <w:sz w:val="20"/>
+        </w:rPr>
+        <w:t xml:space="preserve">If the wizard says the </w:t>
+      </w:r>
+      <w:r>
+        <w:rPr>
+          <w:b/>
+          <w:sz w:val="20"/>
+        </w:rPr>
+        <w:t>other side</w:t>
+      </w:r>
+      <w:r>
+        <w:rPr>
+          <w:b w:val="0"/>
+          <w:sz w:val="20"/>
+        </w:rPr>
+        <w:t xml:space="preserve"> orders warranty, expect </w:t>
+      </w:r>
+      <w:r>
+        <w:rPr>
+          <w:b/>
+          <w:sz w:val="20"/>
+        </w:rPr>
+        <w:t>Confirm Home Warranty</w:t>
+      </w:r>
+      <w:r>
+        <w:rPr>
+          <w:b w:val="0"/>
+          <w:sz w:val="20"/>
+        </w:rPr>
+        <w:t xml:space="preserve"> instead (To = co-op; TC on copy when a TC is assigned).</w:t>
+      </w:r>
+    </w:p>
+    <w:p>
+      <w:pPr>
+        <w:spacing w:after="80"/>
+      </w:pPr>
+      <w:r>
+        <w:rPr>
+          <w:b/>
+          <w:sz w:val="20"/>
+        </w:rPr>
+        <w:t>Expected Result</w:t>
+      </w:r>
+    </w:p>
+    <w:p>
+      <w:pPr>
+        <w:spacing w:after="40"/>
+        <w:ind w:left="357" w:hanging="255"/>
+      </w:pPr>
+      <w:r>
+        <w:rPr>
+          <w:b w:val="0"/>
+          <w:sz w:val="20"/>
+        </w:rPr>
+        <w:t xml:space="preserve">- </w:t>
+      </w:r>
+      <w:r>
+        <w:rPr>
+          <w:b w:val="0"/>
+          <w:sz w:val="20"/>
+        </w:rPr>
+        <w:t xml:space="preserve">Order Home Warranty: </w:t>
+      </w:r>
+      <w:r>
+        <w:rPr>
+          <w:b/>
+          <w:sz w:val="20"/>
+        </w:rPr>
+        <w:t>To:</w:t>
+      </w:r>
+      <w:r>
+        <w:rPr>
+          <w:b w:val="0"/>
+          <w:sz w:val="20"/>
+        </w:rPr>
+        <w:t xml:space="preserve"> the transaction agent (you). TC on copy when assigned. Body is an internal reminder to place the order and send the invoice to title and the co-op. Not a letter to a warranty company.</w:t>
+      </w:r>
+    </w:p>
+    <w:p>
+      <w:pPr>
+        <w:spacing w:after="40"/>
+        <w:ind w:left="357" w:hanging="255"/>
+      </w:pPr>
+      <w:r>
+        <w:rPr>
+          <w:b w:val="0"/>
+          <w:sz w:val="20"/>
+        </w:rPr>
+        <w:t xml:space="preserve">- </w:t>
+      </w:r>
+      <w:r>
+        <w:rPr>
+          <w:b w:val="0"/>
+          <w:sz w:val="20"/>
+        </w:rPr>
+        <w:t>It waits for Send (or stays a draft). It does not send unattended.</w:t>
+      </w:r>
+    </w:p>
+    <w:p>
+      <w:pPr>
+        <w:spacing w:after="40"/>
+        <w:ind w:left="357" w:hanging="255"/>
+      </w:pPr>
+      <w:r>
+        <w:rPr>
+          <w:b w:val="0"/>
+          <w:sz w:val="20"/>
+        </w:rPr>
+        <w:t xml:space="preserve">- </w:t>
+      </w:r>
+      <w:r>
+        <w:rPr>
+          <w:b w:val="0"/>
+          <w:sz w:val="20"/>
+        </w:rPr>
+        <w:t>Fail: To is a warranty company; Autopilot already sent it; Dual still created a co-op Confirm Home Warranty (no co-op).</w:t>
+      </w:r>
+    </w:p>
+    <w:p>
+      <w:pPr>
+        <w:spacing w:after="80"/>
+      </w:pPr>
+      <w:r>
+        <w:rPr>
+          <w:b/>
+          <w:sz w:val="20"/>
+        </w:rPr>
+        <w:t>Feedback</w:t>
+      </w:r>
+    </w:p>
+    <w:p>
+      <w:pPr>
+        <w:spacing w:after="80"/>
+      </w:pPr>
+      <w:r>
+        <w:rPr>
+          <w:b w:val="0"/>
+          <w:sz w:val="20"/>
+        </w:rPr>
+        <w:t>_Please note: Status (Pass / Fail / Needs Work), and any comments or issues you hit._</w:t>
+      </w:r>
+    </w:p>
+    <w:p>
+      <w:pPr>
+        <w:spacing w:after="80"/>
+      </w:pPr>
+      <w:r>
+        <w:rPr>
+          <w:b w:val="0"/>
+          <w:sz w:val="20"/>
+        </w:rPr>
+        <w:t>&gt; _Status:_ &gt; &gt; _Comments:_</w:t>
+      </w:r>
+    </w:p>
+    <w:p>
+      <w:pPr>
+        <w:spacing w:after="120"/>
+      </w:pPr>
+    </w:p>
+    <w:p>
+      <w:pPr>
+        <w:pStyle w:val="Heading2"/>
+        <w:spacing w:after="80" w:before="240"/>
+      </w:pPr>
+      <w:r>
+        <w:t>32. No seller Inspection Completed on new listings</w:t>
+      </w:r>
+    </w:p>
+    <w:p>
+      <w:pPr>
+        <w:spacing w:after="80"/>
+      </w:pPr>
+      <w:r>
+        <w:rPr>
+          <w:b/>
+          <w:sz w:val="20"/>
+        </w:rPr>
+        <w:t>Route / Location</w:t>
+      </w:r>
+    </w:p>
+    <w:p>
+      <w:pPr>
+        <w:spacing w:after="80"/>
+      </w:pPr>
+      <w:r>
+        <w:rPr>
+          <w:b w:val="0"/>
+          <w:sz w:val="20"/>
+        </w:rPr>
+        <w:t>New Sell-Fin or Dual file → Tasks</w:t>
+      </w:r>
+    </w:p>
+    <w:p>
+      <w:pPr>
+        <w:spacing w:after="80"/>
+      </w:pPr>
+      <w:r>
+        <w:rPr>
+          <w:b/>
+          <w:sz w:val="20"/>
+        </w:rPr>
+        <w:t>How To Test</w:t>
+      </w:r>
+    </w:p>
+    <w:p>
+      <w:pPr>
+        <w:spacing w:after="40"/>
+        <w:ind w:left="357" w:hanging="255"/>
+      </w:pPr>
+      <w:r>
+        <w:rPr>
+          <w:b w:val="0"/>
+          <w:sz w:val="20"/>
+        </w:rPr>
+        <w:t xml:space="preserve">1. </w:t>
+      </w:r>
+      <w:r>
+        <w:rPr>
+          <w:b w:val="0"/>
+          <w:sz w:val="20"/>
+        </w:rPr>
+        <w:t xml:space="preserve">On a </w:t>
+      </w:r>
+      <w:r>
+        <w:rPr>
+          <w:b/>
+          <w:sz w:val="20"/>
+        </w:rPr>
+        <w:t>new</w:t>
+      </w:r>
+      <w:r>
+        <w:rPr>
+          <w:b w:val="0"/>
+          <w:sz w:val="20"/>
+        </w:rPr>
+        <w:t xml:space="preserve"> listing, search Tasks for </w:t>
+      </w:r>
+      <w:r>
+        <w:rPr>
+          <w:b/>
+          <w:sz w:val="20"/>
+        </w:rPr>
+        <w:t>Inspection Completed</w:t>
+      </w:r>
+      <w:r>
+        <w:rPr>
+          <w:b w:val="0"/>
+          <w:sz w:val="20"/>
+        </w:rPr>
+        <w:t>.</w:t>
+      </w:r>
+    </w:p>
+    <w:p>
+      <w:pPr>
+        <w:spacing w:after="40"/>
+        <w:ind w:left="357" w:hanging="255"/>
+      </w:pPr>
+      <w:r>
+        <w:rPr>
+          <w:b w:val="0"/>
+          <w:sz w:val="20"/>
+        </w:rPr>
+        <w:t xml:space="preserve">2. </w:t>
+      </w:r>
+      <w:r>
+        <w:rPr>
+          <w:b w:val="0"/>
+          <w:sz w:val="20"/>
+        </w:rPr>
+        <w:t xml:space="preserve">You should still see seller </w:t>
+      </w:r>
+      <w:r>
+        <w:rPr>
+          <w:b/>
+          <w:sz w:val="20"/>
+        </w:rPr>
+        <w:t>Inspection Scheduled</w:t>
+      </w:r>
+      <w:r>
+        <w:rPr>
+          <w:b w:val="0"/>
+          <w:sz w:val="20"/>
+        </w:rPr>
+        <w:t xml:space="preserve"> (notify the seller) and seller </w:t>
+      </w:r>
+      <w:r>
+        <w:rPr>
+          <w:b/>
+          <w:sz w:val="20"/>
+        </w:rPr>
+        <w:t>Inspection Response Reminder</w:t>
+      </w:r>
+      <w:r>
+        <w:rPr>
+          <w:b w:val="0"/>
+          <w:sz w:val="20"/>
+        </w:rPr>
+        <w:t xml:space="preserve"> / </w:t>
+      </w:r>
+      <w:r>
+        <w:rPr>
+          <w:b/>
+          <w:sz w:val="20"/>
+        </w:rPr>
+        <w:t>Inspection Negotiated</w:t>
+      </w:r>
+      <w:r>
+        <w:rPr>
+          <w:b w:val="0"/>
+          <w:sz w:val="20"/>
+        </w:rPr>
+        <w:t>.</w:t>
+      </w:r>
+    </w:p>
+    <w:p>
+      <w:pPr>
+        <w:spacing w:after="40"/>
+        <w:ind w:left="357" w:hanging="255"/>
+      </w:pPr>
+      <w:r>
+        <w:rPr>
+          <w:b w:val="0"/>
+          <w:sz w:val="20"/>
+        </w:rPr>
+        <w:t xml:space="preserve">3. </w:t>
+      </w:r>
+      <w:r>
+        <w:rPr>
+          <w:b w:val="0"/>
+          <w:sz w:val="20"/>
+        </w:rPr>
+        <w:t>On a Dual new file, buyer Inspection Completed may still exist (the buyer has the inspection). The extra seller Inspection Completed row must not.</w:t>
+      </w:r>
+    </w:p>
+    <w:p>
+      <w:pPr>
+        <w:spacing w:after="80"/>
+      </w:pPr>
+      <w:r>
+        <w:rPr>
+          <w:b/>
+          <w:sz w:val="20"/>
+        </w:rPr>
+        <w:t>Expected Result</w:t>
+      </w:r>
+    </w:p>
+    <w:p>
+      <w:pPr>
+        <w:spacing w:after="40"/>
+        <w:ind w:left="357" w:hanging="255"/>
+      </w:pPr>
+      <w:r>
+        <w:rPr>
+          <w:b w:val="0"/>
+          <w:sz w:val="20"/>
+        </w:rPr>
+        <w:t xml:space="preserve">- </w:t>
+      </w:r>
+      <w:r>
+        <w:rPr>
+          <w:b w:val="0"/>
+          <w:sz w:val="20"/>
+        </w:rPr>
+        <w:t xml:space="preserve">New files do not get seller Inspection Completed (old live ID 235). Open 235 rows on </w:t>
+      </w:r>
+      <w:r>
+        <w:rPr>
+          <w:b/>
+          <w:sz w:val="20"/>
+        </w:rPr>
+        <w:t>old</w:t>
+      </w:r>
+      <w:r>
+        <w:rPr>
+          <w:b w:val="0"/>
+          <w:sz w:val="20"/>
+        </w:rPr>
+        <w:t xml:space="preserve"> files can stay until someone completes them.</w:t>
+      </w:r>
+    </w:p>
+    <w:p>
+      <w:pPr>
+        <w:spacing w:after="40"/>
+        <w:ind w:left="357" w:hanging="255"/>
+      </w:pPr>
+      <w:r>
+        <w:rPr>
+          <w:b w:val="0"/>
+          <w:sz w:val="20"/>
+        </w:rPr>
+        <w:t xml:space="preserve">- </w:t>
+      </w:r>
+      <w:r>
+        <w:rPr>
+          <w:b w:val="0"/>
+          <w:sz w:val="20"/>
+        </w:rPr>
+        <w:t>Fail: a new listing generates Inspection Completed for the seller.</w:t>
       </w:r>
     </w:p>
     <w:p>

</xml_diff>